<commit_message>
added sharing pdfs function for mobile friendliness
</commit_message>
<xml_diff>
--- a/agreements/1. Move in Form - quantity.docx
+++ b/agreements/1. Move in Form - quantity.docx
@@ -815,6 +815,7 @@
           <w:spacing w:val="-11"/>
           <w:u w:val="single"/>
         </w:rPr>
+        <w:pageBreakBefore/>
       </w:pPr>
       <w:r>
         <w:rPr>
@@ -8731,13 +8732,139 @@
       </w:pPr>
     </w:p>
     <w:sectPr>
+      <w:headerReference w:type="first" r:id="rIdNestHeader"/>
       <w:type w:val="continuous"/>
       <w:pgSz w:w="12240" w:h="15840"/>
-      <w:pgMar w:top="1040" w:right="1080" w:bottom="280" w:left="1440" w:header="720" w:footer="720" w:gutter="0"/>
+      <w:pgMar w:top="1040" w:right="1080" w:bottom="280" w:left="1440" w:header="1300" w:footer="720" w:gutter="0"/>
       <w:cols w:space="720"/>
+      <w:titlePg/>
     </w:sectPr>
   </w:body>
 </w:document>
+</file>
+
+<file path=word/nest-header.xml><?xml version="1.0" encoding="utf-8"?>
+<w:hdr xmlns:m="http://schemas.openxmlformats.org/officeDocument/2006/math" xmlns:mc="http://schemas.openxmlformats.org/markup-compatibility/2006" xmlns:mo="http://schemas.microsoft.com/office/mac/office/2008/main" xmlns:mv="urn:schemas-microsoft-com:mac:vml" xmlns:o="urn:schemas-microsoft-com:office:office" xmlns:r="http://schemas.openxmlformats.org/officeDocument/2006/relationships" xmlns:v="urn:schemas-microsoft-com:vml" xmlns:w10="urn:schemas-microsoft-com:office:word" xmlns:w14="http://schemas.microsoft.com/office/word/2010/wordml" xmlns:w="http://schemas.openxmlformats.org/wordprocessingml/2006/main" xmlns:wne="http://schemas.microsoft.com/office/word/2006/wordml" xmlns:wp14="http://schemas.microsoft.com/office/word/2010/wordprocessingDrawing" xmlns:wp="http://schemas.openxmlformats.org/drawingml/2006/wordprocessingDrawing" xmlns:wpc="http://schemas.microsoft.com/office/word/2010/wordprocessingCanvas" xmlns:wpg="http://schemas.microsoft.com/office/word/2010/wordprocessingGroup" xmlns:wpi="http://schemas.microsoft.com/office/word/2010/wordprocessingInk" xmlns:wps="http://schemas.microsoft.com/office/word/2010/wordprocessingShape" mc:Ignorable="w14 wp14">
+  <w:p>
+    <w:pPr>
+      <w:pStyle w:val="Header"/>
+      <w:spacing w:after="200"/>
+      <w:jc w:val="center"/>
+    </w:pPr>
+    <w:r>
+      <w:drawing>
+        <wp:inline xmlns:a="http://schemas.openxmlformats.org/drawingml/2006/main" xmlns:pic="http://schemas.openxmlformats.org/drawingml/2006/picture">
+          <wp:extent cx="889000" cy="762000"/>
+          <wp:docPr id="1" name="Picture 1"/>
+          <wp:cNvGraphicFramePr>
+            <a:graphicFrameLocks noChangeAspect="1"/>
+          </wp:cNvGraphicFramePr>
+          <a:graphic>
+            <a:graphicData uri="http://schemas.openxmlformats.org/drawingml/2006/picture">
+              <pic:pic>
+                <pic:nvPicPr>
+                  <pic:cNvPr id="0" name="business_card.jpg"/>
+                  <pic:cNvPicPr/>
+                </pic:nvPicPr>
+                <pic:blipFill>
+                  <a:blip r:embed="rId1"/>
+                  <a:srcRect l="67619" t="16667" r="6190" b="44167"/>
+                  <a:stretch>
+                    <a:fillRect/>
+                  </a:stretch>
+                </pic:blipFill>
+                <pic:spPr>
+                  <a:xfrm>
+                    <a:off x="0" y="0"/>
+                    <a:ext cx="889000" cy="762000"/>
+                  </a:xfrm>
+                  <a:prstGeom prst="rect"/>
+                </pic:spPr>
+              </pic:pic>
+            </a:graphicData>
+          </a:graphic>
+        </wp:inline>
+      </w:drawing>
+    </w:r>
+  </w:p>
+  <w:p>
+    <w:pPr>
+      <w:spacing w:after="40" w:line="240" w:lineRule="auto"/>
+      <w:jc w:val="center"/>
+    </w:pPr>
+    <w:bookmarkStart w:id="2" w:name="NestHeader_name"/>
+    <w:r>
+      <w:rPr>
+        <w:rFonts w:ascii="Arial" w:hAnsi="Arial"/>
+        <w:b/>
+        <w:sz w:val="22"/>
+      </w:rPr>
+      <w:t>NEST &amp; NOOK PROPERTY CARE</w:t>
+    </w:r>
+    <w:bookmarkEnd w:id="2"/>
+  </w:p>
+  <w:p>
+    <w:pPr>
+      <w:spacing w:after="40" w:line="240" w:lineRule="auto"/>
+      <w:jc w:val="center"/>
+    </w:pPr>
+    <w:bookmarkStart w:id="3" w:name="NestHeader_registration"/>
+    <w:r>
+      <w:rPr>
+        <w:rFonts w:ascii="Arial" w:hAnsi="Arial"/>
+        <w:b/>
+        <w:sz w:val="24"/>
+      </w:rPr>
+      <w:t>202603156166 (KT0615852-M)</w:t>
+    </w:r>
+    <w:bookmarkEnd w:id="3"/>
+  </w:p>
+  <w:p>
+    <w:pPr>
+      <w:spacing w:after="40" w:line="240" w:lineRule="auto"/>
+      <w:jc w:val="center"/>
+    </w:pPr>
+    <w:bookmarkStart w:id="4" w:name="NestHeader_address"/>
+    <w:r>
+      <w:rPr>
+        <w:rFonts w:ascii="Times New Roman" w:hAnsi="Times New Roman"/>
+        <w:b/>
+        <w:sz w:val="21"/>
+      </w:rPr>
+      <w:t>#16-03, Trellis Residences, 80100, J.B, Johor.</w:t>
+    </w:r>
+    <w:bookmarkEnd w:id="4"/>
+  </w:p>
+  <w:p>
+    <w:pPr>
+      <w:spacing w:after="40" w:line="240" w:lineRule="auto"/>
+      <w:jc w:val="center"/>
+    </w:pPr>
+    <w:bookmarkStart w:id="5" w:name="NestHeader_phone"/>
+    <w:r>
+      <w:rPr>
+        <w:rFonts w:ascii="Times New Roman" w:hAnsi="Times New Roman"/>
+        <w:b/>
+        <w:sz w:val="23"/>
+      </w:rPr>
+      <w:t>TEL NO.: +60111-3380335</w:t>
+    </w:r>
+    <w:bookmarkEnd w:id="5"/>
+  </w:p>
+  <w:p>
+    <w:pPr>
+      <w:spacing w:after="240" w:line="20" w:lineRule="exact"/>
+      <w:pBdr>
+        <w:bottom w:val="single" w:sz="4" w:space="1" w:color="000000"/>
+      </w:pBdr>
+    </w:pPr>
+    <w:r>
+      <w:rPr>
+        <w:sz w:val="2"/>
+      </w:rPr>
+    </w:r>
+  </w:p>
+</w:hdr>
 </file>
 
 <file path=word/numbering.xml><?xml version="1.0" encoding="utf-8"?>

</xml_diff>

<commit_message>
- added chinese translation - updated all templates
</commit_message>
<xml_diff>
--- a/agreements/1. Move in Form - quantity.docx
+++ b/agreements/1. Move in Form - quantity.docx
@@ -887,77 +887,19 @@
       <w:pPr>
         <w:pStyle w:val="Heading1"/>
         <w:spacing w:line="216" w:lineRule="exact"/>
-        <w:ind w:left="40" w:right="27"/>
+        <w:ind w:left="0" w:right="27"/>
         <w:jc w:val="center"/>
+        <w:rPr>
+          <w:spacing w:val="-11"/>
+          <w:u w:val="single"/>
+        </w:rPr>
       </w:pPr>
-      <w:r>
-        <w:rPr>
-          <w:noProof/>
-        </w:rPr>
-        <w:drawing>
-          <wp:anchor distT="0" distB="0" distL="114300" distR="114300" simplePos="0" relativeHeight="251658752" behindDoc="1" locked="0" layoutInCell="1" allowOverlap="1" wp14:anchorId="4117EB9B" wp14:editId="60654992">
-            <wp:simplePos x="0" y="0"/>
-            <wp:positionH relativeFrom="column">
-              <wp:posOffset>4653643</wp:posOffset>
-            </wp:positionH>
-            <wp:positionV relativeFrom="page">
-              <wp:posOffset>8986157</wp:posOffset>
-            </wp:positionV>
-            <wp:extent cx="1303020" cy="730250"/>
-            <wp:effectExtent l="0" t="0" r="0" b="0"/>
-            <wp:wrapNone/>
-            <wp:docPr id="263861726" name="Picture 1"/>
-            <wp:cNvGraphicFramePr>
-              <a:graphicFrameLocks xmlns:a="http://schemas.openxmlformats.org/drawingml/2006/main" noChangeAspect="1"/>
-            </wp:cNvGraphicFramePr>
-            <a:graphic xmlns:a="http://schemas.openxmlformats.org/drawingml/2006/main">
-              <a:graphicData uri="http://schemas.openxmlformats.org/drawingml/2006/picture">
-                <pic:pic xmlns:pic="http://schemas.openxmlformats.org/drawingml/2006/picture">
-                  <pic:nvPicPr>
-                    <pic:cNvPr id="263861726" name="Picture 1"/>
-                    <pic:cNvPicPr>
-                      <a:picLocks noChangeAspect="1"/>
-                    </pic:cNvPicPr>
-                  </pic:nvPicPr>
-                  <pic:blipFill>
-                    <a:blip r:embed="rId7" cstate="print">
-                      <a:extLst>
-                        <a:ext uri="{28A0092B-C50C-407E-A947-70E740481C1C}">
-                          <a14:useLocalDpi xmlns:a14="http://schemas.microsoft.com/office/drawing/2010/main" val="0"/>
-                        </a:ext>
-                      </a:extLst>
-                    </a:blip>
-                    <a:srcRect/>
-                    <a:stretch>
-                      <a:fillRect/>
-                    </a:stretch>
-                  </pic:blipFill>
-                  <pic:spPr bwMode="auto">
-                    <a:xfrm>
-                      <a:off x="0" y="0"/>
-                      <a:ext cx="1303020" cy="730250"/>
-                    </a:xfrm>
-                    <a:prstGeom prst="rect">
-                      <a:avLst/>
-                    </a:prstGeom>
-                    <a:noFill/>
-                    <a:ln>
-                      <a:noFill/>
-                    </a:ln>
-                  </pic:spPr>
-                </pic:pic>
-              </a:graphicData>
-            </a:graphic>
-          </wp:anchor>
-        </w:drawing>
-      </w:r>
     </w:p>
     <w:p>
       <w:pPr>
         <w:pStyle w:val="Heading1"/>
-        <w:pageBreakBefore/>
         <w:spacing w:line="216" w:lineRule="exact"/>
-        <w:ind w:left="40" w:right="27"/>
+        <w:ind w:left="0" w:right="27"/>
         <w:jc w:val="center"/>
         <w:rPr>
           <w:spacing w:val="-11"/>
@@ -969,7 +911,6 @@
           <w:spacing w:val="-11"/>
           <w:u w:val="single"/>
         </w:rPr>
-        <w:lastRenderedPageBreak/>
         <w:t>CHECK-IN</w:t>
       </w:r>
     </w:p>
@@ -9314,505 +9255,13 @@
     </w:p>
     <w:p>
       <w:pPr>
-        <w:spacing w:before="107"/>
-        <w:rPr>
-          <w:sz w:val="20"/>
-        </w:rPr>
-      </w:pPr>
-      <w:r>
-        <w:rPr>
-          <w:noProof/>
-          <w:sz w:val="20"/>
-        </w:rPr>
-        <mc:AlternateContent>
-          <mc:Choice Requires="wps">
-            <w:drawing>
-              <wp:anchor distT="0" distB="0" distL="0" distR="0" simplePos="0" relativeHeight="251654656" behindDoc="1" locked="0" layoutInCell="1" allowOverlap="1" wp14:anchorId="5F67BC36" wp14:editId="161A3125">
-                <wp:simplePos x="0" y="0"/>
-                <wp:positionH relativeFrom="page">
-                  <wp:posOffset>2374264</wp:posOffset>
-                </wp:positionH>
-                <wp:positionV relativeFrom="paragraph">
-                  <wp:posOffset>249212</wp:posOffset>
-                </wp:positionV>
-                <wp:extent cx="3441065" cy="697865"/>
-                <wp:effectExtent l="0" t="0" r="0" b="0"/>
-                <wp:wrapTopAndBottom/>
-                <wp:docPr id="2" name="Textbox 2"/>
-                <wp:cNvGraphicFramePr>
-                  <a:graphicFrameLocks xmlns:a="http://schemas.openxmlformats.org/drawingml/2006/main"/>
-                </wp:cNvGraphicFramePr>
-                <a:graphic xmlns:a="http://schemas.openxmlformats.org/drawingml/2006/main">
-                  <a:graphicData uri="http://schemas.microsoft.com/office/word/2010/wordprocessingShape">
-                    <wps:wsp>
-                      <wps:cNvSpPr txBox="1">
-                        <a:spLocks/>
-                      </wps:cNvSpPr>
-                      <wps:spPr>
-                        <a:xfrm>
-                          <a:off x="0" y="0"/>
-                          <a:ext cx="3441065" cy="697865"/>
-                        </a:xfrm>
-                        <a:prstGeom prst="rect">
-                          <a:avLst/>
-                        </a:prstGeom>
-                        <a:ln w="6096">
-                          <a:solidFill>
-                            <a:srgbClr val="000000"/>
-                          </a:solidFill>
-                          <a:prstDash val="solid"/>
-                        </a:ln>
-                      </wps:spPr>
-                      <wps:txbx>
-                        <w:txbxContent>
-                          <w:p>
-                            <w:pPr>
-                              <w:pStyle w:val="BodyText"/>
-                              <w:spacing w:before="88" w:line="247" w:lineRule="auto"/>
-                              <w:ind w:left="117" w:right="544"/>
-                              <w:rPr>
-                                <w:rFonts w:ascii="SimSun"/>
-                              </w:rPr>
-                            </w:pPr>
-                            <w:bookmarkStart w:id="178" w:name="NNF_179_5160_480_18_0_K"/>
-                            <w:r>
-                              <w:rPr>
-                                <w:rFonts w:ascii="SimSun"/>
-                              </w:rPr>
-                              <w:t>All</w:t>
-                            </w:r>
-                            <w:r>
-                              <w:rPr>
-                                <w:rFonts w:ascii="SimSun"/>
-                                <w:spacing w:val="-1"/>
-                              </w:rPr>
-                              <w:t xml:space="preserve"> </w:t>
-                            </w:r>
-                            <w:r>
-                              <w:rPr>
-                                <w:rFonts w:ascii="SimSun"/>
-                              </w:rPr>
-                              <w:t>the</w:t>
-                            </w:r>
-                            <w:r>
-                              <w:rPr>
-                                <w:rFonts w:ascii="SimSun"/>
-                                <w:spacing w:val="-21"/>
-                              </w:rPr>
-                              <w:t xml:space="preserve"> </w:t>
-                            </w:r>
-                            <w:r>
-                              <w:rPr>
-                                <w:rFonts w:ascii="SimSun"/>
-                              </w:rPr>
-                              <w:t>payment</w:t>
-                            </w:r>
-                            <w:r>
-                              <w:rPr>
-                                <w:rFonts w:ascii="SimSun"/>
-                                <w:spacing w:val="-15"/>
-                              </w:rPr>
-                              <w:t xml:space="preserve"> </w:t>
-                            </w:r>
-                            <w:r>
-                              <w:rPr>
-                                <w:rFonts w:ascii="SimSun"/>
-                              </w:rPr>
-                              <w:t>must</w:t>
-                            </w:r>
-                            <w:r>
-                              <w:rPr>
-                                <w:rFonts w:ascii="SimSun"/>
-                                <w:spacing w:val="-18"/>
-                              </w:rPr>
-                              <w:t xml:space="preserve"> </w:t>
-                            </w:r>
-                            <w:r>
-                              <w:rPr>
-                                <w:rFonts w:ascii="SimSun"/>
-                              </w:rPr>
-                              <w:t>be</w:t>
-                            </w:r>
-                            <w:r>
-                              <w:rPr>
-                                <w:rFonts w:ascii="SimSun"/>
-                                <w:spacing w:val="-17"/>
-                              </w:rPr>
-                              <w:t xml:space="preserve"> </w:t>
-                            </w:r>
-                            <w:r>
-                              <w:rPr>
-                                <w:rFonts w:ascii="SimSun"/>
-                              </w:rPr>
-                              <w:t>made to</w:t>
-                            </w:r>
-                            <w:r>
-                              <w:rPr>
-                                <w:rFonts w:ascii="SimSun"/>
-                                <w:spacing w:val="-1"/>
-                              </w:rPr>
-                              <w:t xml:space="preserve"> </w:t>
-                            </w:r>
-                            <w:r>
-                              <w:rPr>
-                                <w:rFonts w:ascii="SimSun"/>
-                              </w:rPr>
-                              <w:t>our</w:t>
-                            </w:r>
-                            <w:r>
-                              <w:rPr>
-                                <w:rFonts w:ascii="SimSun"/>
-                                <w:spacing w:val="-4"/>
-                              </w:rPr>
-                              <w:t xml:space="preserve"> </w:t>
-                            </w:r>
-                            <w:r>
-                              <w:rPr>
-                                <w:rFonts w:ascii="SimSun"/>
-                              </w:rPr>
-                              <w:t xml:space="preserve">account: Account Name: </w:t>
-                            </w:r>
-                            <w:r>
-                              <w:rPr>
-                                <w:rFonts w:ascii="SimSun"/>
-                              </w:rPr>
-                              <w:t>{{company.account_name}}</w:t>
-                            </w:r>
-                            <w:bookmarkEnd w:id="178"/>
-                          </w:p>
-                          <w:p>
-                            <w:pPr>
-                              <w:pStyle w:val="BodyText"/>
-                              <w:spacing w:line="190" w:lineRule="exact"/>
-                              <w:ind w:left="117"/>
-                              <w:rPr>
-                                <w:rFonts w:ascii="SimSun"/>
-                              </w:rPr>
-                            </w:pPr>
-                            <w:bookmarkStart w:id="179" w:name="NNF_180_5160_208_18_0_K"/>
-                            <w:r>
-                              <w:rPr>
-                                <w:rFonts w:ascii="SimSun"/>
-                              </w:rPr>
-                              <w:t>Account</w:t>
-                            </w:r>
-                            <w:r>
-                              <w:rPr>
-                                <w:rFonts w:ascii="SimSun"/>
-                                <w:spacing w:val="-23"/>
-                              </w:rPr>
-                              <w:t xml:space="preserve"> </w:t>
-                            </w:r>
-                            <w:r>
-                              <w:rPr>
-                                <w:rFonts w:ascii="SimSun"/>
-                              </w:rPr>
-                              <w:t>Number:</w:t>
-                            </w:r>
-                            <w:r>
-                              <w:rPr>
-                                <w:rFonts w:ascii="SimSun"/>
-                                <w:spacing w:val="-19"/>
-                              </w:rPr>
-                              <w:t xml:space="preserve"> </w:t>
-                            </w:r>
-                            <w:r>
-                              <w:rPr>
-                                <w:rFonts w:ascii="SimSun"/>
-                                <w:spacing w:val="-2"/>
-                              </w:rPr>
-                              <w:t>{{company.account_number}}</w:t>
-                            </w:r>
-                            <w:bookmarkEnd w:id="179"/>
-                          </w:p>
-                          <w:p>
-                            <w:pPr>
-                              <w:pStyle w:val="BodyText"/>
-                              <w:tabs>
-                                <w:tab w:val="left" w:pos="837"/>
-                              </w:tabs>
-                              <w:spacing w:line="231" w:lineRule="exact"/>
-                              <w:ind w:left="117"/>
-                              <w:rPr>
-                                <w:rFonts w:ascii="SimSun"/>
-                              </w:rPr>
-                            </w:pPr>
-                            <w:bookmarkStart w:id="180" w:name="NNF_181_4440_208_18_0_K"/>
-                            <w:r>
-                              <w:rPr>
-                                <w:rFonts w:ascii="SimSun"/>
-                                <w:spacing w:val="-2"/>
-                              </w:rPr>
-                              <w:t>Bank:</w:t>
-                            </w:r>
-                            <w:r>
-                              <w:rPr>
-                                <w:rFonts w:ascii="SimSun"/>
-                              </w:rPr>
-                              <w:tab/>
-                            </w:r>
-                            <w:r>
-                              <w:rPr>
-                                <w:rFonts w:ascii="SimSun"/>
-                              </w:rPr>
-                              <w:t>{{company.bank}}</w:t>
-                            </w:r>
-                            <w:bookmarkEnd w:id="180"/>
-                          </w:p>
-                        </w:txbxContent>
-                      </wps:txbx>
-                      <wps:bodyPr wrap="square" lIns="0" tIns="0" rIns="0" bIns="0" rtlCol="0">
-                        <a:noAutofit/>
-                      </wps:bodyPr>
-                    </wps:wsp>
-                  </a:graphicData>
-                </a:graphic>
-              </wp:anchor>
-            </w:drawing>
-          </mc:Choice>
-          <mc:Fallback>
-            <w:pict>
-              <v:shape w14:anchorId="5F67BC36" id="Textbox 2" o:spid="_x0000_s1027" type="#_x0000_t202" style="position:absolute;margin-left:186.95pt;margin-top:19.6pt;width:270.95pt;height:54.95pt;z-index:-251661824;visibility:visible;mso-wrap-style:square;mso-wrap-distance-left:0;mso-wrap-distance-top:0;mso-wrap-distance-right:0;mso-wrap-distance-bottom:0;mso-position-horizontal:absolute;mso-position-horizontal-relative:page;mso-position-vertical:absolute;mso-position-vertical-relative:text;v-text-anchor:top" o:gfxdata="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" filled="f" strokeweight=".48pt">
-                <v:path arrowok="t"/>
-                <v:textbox inset="0,0,0,0">
-                  <w:txbxContent>
-                    <w:p>
-                      <w:pPr>
-                        <w:pStyle w:val="BodyText"/>
-                        <w:spacing w:before="88" w:line="247" w:lineRule="auto"/>
-                        <w:ind w:left="117" w:right="544"/>
-                        <w:rPr>
-                          <w:rFonts w:ascii="SimSun"/>
-                        </w:rPr>
-                      </w:pPr>
-                      <w:bookmarkStart w:id="181" w:name="NNF_179_5160_480_18_0_K"/>
-                      <w:r>
-                        <w:rPr>
-                          <w:rFonts w:ascii="SimSun"/>
-                        </w:rPr>
-                        <w:t>All</w:t>
-                      </w:r>
-                      <w:r>
-                        <w:rPr>
-                          <w:rFonts w:ascii="SimSun"/>
-                          <w:spacing w:val="-1"/>
-                        </w:rPr>
-                        <w:t xml:space="preserve"> </w:t>
-                      </w:r>
-                      <w:r>
-                        <w:rPr>
-                          <w:rFonts w:ascii="SimSun"/>
-                        </w:rPr>
-                        <w:t>the</w:t>
-                      </w:r>
-                      <w:r>
-                        <w:rPr>
-                          <w:rFonts w:ascii="SimSun"/>
-                          <w:spacing w:val="-21"/>
-                        </w:rPr>
-                        <w:t xml:space="preserve"> </w:t>
-                      </w:r>
-                      <w:r>
-                        <w:rPr>
-                          <w:rFonts w:ascii="SimSun"/>
-                        </w:rPr>
-                        <w:t>payment</w:t>
-                      </w:r>
-                      <w:r>
-                        <w:rPr>
-                          <w:rFonts w:ascii="SimSun"/>
-                          <w:spacing w:val="-15"/>
-                        </w:rPr>
-                        <w:t xml:space="preserve"> </w:t>
-                      </w:r>
-                      <w:r>
-                        <w:rPr>
-                          <w:rFonts w:ascii="SimSun"/>
-                        </w:rPr>
-                        <w:t>must</w:t>
-                      </w:r>
-                      <w:r>
-                        <w:rPr>
-                          <w:rFonts w:ascii="SimSun"/>
-                          <w:spacing w:val="-18"/>
-                        </w:rPr>
-                        <w:t xml:space="preserve"> </w:t>
-                      </w:r>
-                      <w:r>
-                        <w:rPr>
-                          <w:rFonts w:ascii="SimSun"/>
-                        </w:rPr>
-                        <w:t>be</w:t>
-                      </w:r>
-                      <w:r>
-                        <w:rPr>
-                          <w:rFonts w:ascii="SimSun"/>
-                          <w:spacing w:val="-17"/>
-                        </w:rPr>
-                        <w:t xml:space="preserve"> </w:t>
-                      </w:r>
-                      <w:r>
-                        <w:rPr>
-                          <w:rFonts w:ascii="SimSun"/>
-                        </w:rPr>
-                        <w:t>made to</w:t>
-                      </w:r>
-                      <w:r>
-                        <w:rPr>
-                          <w:rFonts w:ascii="SimSun"/>
-                          <w:spacing w:val="-1"/>
-                        </w:rPr>
-                        <w:t xml:space="preserve"> </w:t>
-                      </w:r>
-                      <w:r>
-                        <w:rPr>
-                          <w:rFonts w:ascii="SimSun"/>
-                        </w:rPr>
-                        <w:t>our</w:t>
-                      </w:r>
-                      <w:r>
-                        <w:rPr>
-                          <w:rFonts w:ascii="SimSun"/>
-                          <w:spacing w:val="-4"/>
-                        </w:rPr>
-                        <w:t xml:space="preserve"> </w:t>
-                      </w:r>
-                      <w:r>
-                        <w:rPr>
-                          <w:rFonts w:ascii="SimSun"/>
-                        </w:rPr>
-                        <w:t xml:space="preserve">account: Account Name: </w:t>
-                      </w:r>
-                      <w:r>
-                        <w:rPr>
-                          <w:rFonts w:ascii="SimSun"/>
-                        </w:rPr>
-                        <w:t>{{company.account_name}}</w:t>
-                      </w:r>
-                      <w:bookmarkEnd w:id="181"/>
-                    </w:p>
-                    <w:p>
-                      <w:pPr>
-                        <w:pStyle w:val="BodyText"/>
-                        <w:spacing w:line="190" w:lineRule="exact"/>
-                        <w:ind w:left="117"/>
-                        <w:rPr>
-                          <w:rFonts w:ascii="SimSun"/>
-                        </w:rPr>
-                      </w:pPr>
-                      <w:bookmarkStart w:id="182" w:name="NNF_180_5160_208_18_0_K"/>
-                      <w:r>
-                        <w:rPr>
-                          <w:rFonts w:ascii="SimSun"/>
-                        </w:rPr>
-                        <w:t>Account</w:t>
-                      </w:r>
-                      <w:r>
-                        <w:rPr>
-                          <w:rFonts w:ascii="SimSun"/>
-                          <w:spacing w:val="-23"/>
-                        </w:rPr>
-                        <w:t xml:space="preserve"> </w:t>
-                      </w:r>
-                      <w:r>
-                        <w:rPr>
-                          <w:rFonts w:ascii="SimSun"/>
-                        </w:rPr>
-                        <w:t>Number:</w:t>
-                      </w:r>
-                      <w:r>
-                        <w:rPr>
-                          <w:rFonts w:ascii="SimSun"/>
-                          <w:spacing w:val="-19"/>
-                        </w:rPr>
-                        <w:t xml:space="preserve"> </w:t>
-                      </w:r>
-                      <w:r>
-                        <w:rPr>
-                          <w:rFonts w:ascii="SimSun"/>
-                          <w:spacing w:val="-2"/>
-                        </w:rPr>
-                        <w:t>{{company.account_number}}</w:t>
-                      </w:r>
-                      <w:bookmarkEnd w:id="182"/>
-                    </w:p>
-                    <w:p>
-                      <w:pPr>
-                        <w:pStyle w:val="BodyText"/>
-                        <w:tabs>
-                          <w:tab w:val="left" w:pos="837"/>
-                        </w:tabs>
-                        <w:spacing w:line="231" w:lineRule="exact"/>
-                        <w:ind w:left="117"/>
-                        <w:rPr>
-                          <w:rFonts w:ascii="SimSun"/>
-                        </w:rPr>
-                      </w:pPr>
-                      <w:bookmarkStart w:id="183" w:name="NNF_181_4440_208_18_0_K"/>
-                      <w:r>
-                        <w:rPr>
-                          <w:rFonts w:ascii="SimSun"/>
-                          <w:spacing w:val="-2"/>
-                        </w:rPr>
-                        <w:t>Bank:</w:t>
-                      </w:r>
-                      <w:r>
-                        <w:rPr>
-                          <w:rFonts w:ascii="SimSun"/>
-                        </w:rPr>
-                        <w:tab/>
-                      </w:r>
-                      <w:r>
-                        <w:rPr>
-                          <w:rFonts w:ascii="SimSun"/>
-                        </w:rPr>
-                        <w:t>{{company.bank}}</w:t>
-                      </w:r>
-                      <w:bookmarkEnd w:id="183"/>
-                    </w:p>
-                  </w:txbxContent>
-                </v:textbox>
-                <w10:wrap type="topAndBottom" anchorx="page"/>
-              </v:shape>
-            </w:pict>
-          </mc:Fallback>
-        </mc:AlternateContent>
-      </w:r>
-    </w:p>
-    <w:p>
-      <w:pPr>
-        <w:pStyle w:val="Heading1"/>
         <w:tabs>
-          <w:tab w:val="left" w:pos="4550"/>
-        </w:tabs>
-        <w:ind w:left="0"/>
-        <w:rPr>
-          <w:rFonts w:eastAsia="SimSun"/>
-          <w:lang w:eastAsia="zh-CN"/>
-        </w:rPr>
-      </w:pPr>
-    </w:p>
-    <w:p>
-      <w:pPr>
-        <w:pStyle w:val="Heading1"/>
-        <w:tabs>
-          <w:tab w:val="left" w:pos="4550"/>
+          <w:tab w:val="left" w:pos="5331"/>
         </w:tabs>
         <w:rPr>
-          <w:rFonts w:eastAsia="SimSun"/>
-          <w:lang w:eastAsia="zh-CN"/>
-        </w:rPr>
-      </w:pPr>
-    </w:p>
-    <w:p>
-      <w:pPr>
-        <w:pStyle w:val="Heading1"/>
-        <w:tabs>
-          <w:tab w:val="left" w:pos="4550"/>
-        </w:tabs>
-        <w:rPr>
-          <w:rFonts w:eastAsia="SimSun"/>
-          <w:lang w:eastAsia="zh-CN"/>
+          <w:rFonts w:ascii="Cambria" w:eastAsia="Cambria" w:hAnsi="Cambria" w:cs="Cambria"/>
+          <w:b/>
+          <w:sz w:val="20"/>
         </w:rPr>
       </w:pPr>
     </w:p>
@@ -9965,16 +9414,16 @@
           <w:sz w:val="20"/>
         </w:rPr>
         <w:drawing>
-          <wp:anchor distT="0" distB="0" distL="114300" distR="114300" simplePos="0" relativeHeight="251653632" behindDoc="1" locked="0" layoutInCell="1" allowOverlap="1" wp14:anchorId="66A9265C" wp14:editId="0BFBD680">
+          <wp:anchor distT="0" distB="0" distL="114300" distR="114300" simplePos="0" relativeHeight="251657216" behindDoc="1" locked="0" layoutInCell="1" allowOverlap="1" wp14:anchorId="66A9265C" wp14:editId="5319276A">
             <wp:simplePos x="0" y="0"/>
             <wp:positionH relativeFrom="column">
-              <wp:posOffset>4554311</wp:posOffset>
+              <wp:posOffset>4762046</wp:posOffset>
             </wp:positionH>
             <wp:positionV relativeFrom="paragraph">
-              <wp:posOffset>36013</wp:posOffset>
+              <wp:posOffset>91440</wp:posOffset>
             </wp:positionV>
-            <wp:extent cx="760730" cy="772795"/>
-            <wp:effectExtent l="0" t="0" r="1270" b="8255"/>
+            <wp:extent cx="734029" cy="745671"/>
+            <wp:effectExtent l="0" t="0" r="9525" b="0"/>
             <wp:wrapNone/>
             <wp:docPr id="158468785" name="Picture 5"/>
             <wp:cNvGraphicFramePr>
@@ -9985,6 +9434,67 @@
                 <pic:pic xmlns:pic="http://schemas.openxmlformats.org/drawingml/2006/picture">
                   <pic:nvPicPr>
                     <pic:cNvPr id="0" name="Picture 2"/>
+                    <pic:cNvPicPr>
+                      <a:picLocks noChangeAspect="1" noChangeArrowheads="1"/>
+                    </pic:cNvPicPr>
+                  </pic:nvPicPr>
+                  <pic:blipFill>
+                    <a:blip r:embed="rId7" cstate="print">
+                      <a:extLst>
+                        <a:ext uri="{28A0092B-C50C-407E-A947-70E740481C1C}">
+                          <a14:useLocalDpi xmlns:a14="http://schemas.microsoft.com/office/drawing/2010/main" val="0"/>
+                        </a:ext>
+                      </a:extLst>
+                    </a:blip>
+                    <a:srcRect/>
+                    <a:stretch>
+                      <a:fillRect/>
+                    </a:stretch>
+                  </pic:blipFill>
+                  <pic:spPr bwMode="auto">
+                    <a:xfrm>
+                      <a:off x="0" y="0"/>
+                      <a:ext cx="734029" cy="745671"/>
+                    </a:xfrm>
+                    <a:prstGeom prst="rect">
+                      <a:avLst/>
+                    </a:prstGeom>
+                    <a:noFill/>
+                    <a:ln>
+                      <a:noFill/>
+                    </a:ln>
+                  </pic:spPr>
+                </pic:pic>
+              </a:graphicData>
+            </a:graphic>
+            <wp14:sizeRelH relativeFrom="margin">
+              <wp14:pctWidth>0</wp14:pctWidth>
+            </wp14:sizeRelH>
+            <wp14:sizeRelV relativeFrom="margin">
+              <wp14:pctHeight>0</wp14:pctHeight>
+            </wp14:sizeRelV>
+          </wp:anchor>
+        </w:drawing>
+      </w:r>
+      <w:r>
+        <w:rPr>
+          <w:rFonts w:ascii="Cambria" w:eastAsia="Cambria" w:hAnsi="Cambria" w:cs="Cambria"/>
+          <w:noProof/>
+          <w:sz w:val="20"/>
+        </w:rPr>
+        <w:drawing>
+          <wp:inline distT="0" distB="0" distL="0" distR="0" wp14:anchorId="600C27C1" wp14:editId="3FD830AF">
+            <wp:extent cx="1473867" cy="827315"/>
+            <wp:effectExtent l="0" t="0" r="0" b="0"/>
+            <wp:docPr id="216268787" name="Picture 7"/>
+            <wp:cNvGraphicFramePr>
+              <a:graphicFrameLocks xmlns:a="http://schemas.openxmlformats.org/drawingml/2006/main" noChangeAspect="1"/>
+            </wp:cNvGraphicFramePr>
+            <a:graphic xmlns:a="http://schemas.openxmlformats.org/drawingml/2006/main">
+              <a:graphicData uri="http://schemas.openxmlformats.org/drawingml/2006/picture">
+                <pic:pic xmlns:pic="http://schemas.openxmlformats.org/drawingml/2006/picture">
+                  <pic:nvPicPr>
+                    <pic:cNvPr id="0" name="Picture 4"/>
                     <pic:cNvPicPr>
                       <a:picLocks noChangeAspect="1" noChangeArrowheads="1"/>
                     </pic:cNvPicPr>
@@ -10005,62 +9515,7 @@
                   <pic:spPr bwMode="auto">
                     <a:xfrm>
                       <a:off x="0" y="0"/>
-                      <a:ext cx="760730" cy="772795"/>
-                    </a:xfrm>
-                    <a:prstGeom prst="rect">
-                      <a:avLst/>
-                    </a:prstGeom>
-                    <a:noFill/>
-                    <a:ln>
-                      <a:noFill/>
-                    </a:ln>
-                  </pic:spPr>
-                </pic:pic>
-              </a:graphicData>
-            </a:graphic>
-          </wp:anchor>
-        </w:drawing>
-      </w:r>
-      <w:r>
-        <w:rPr>
-          <w:rFonts w:ascii="Cambria" w:eastAsia="Cambria" w:hAnsi="Cambria" w:cs="Cambria"/>
-          <w:noProof/>
-          <w:sz w:val="20"/>
-        </w:rPr>
-        <w:drawing>
-          <wp:inline distT="0" distB="0" distL="0" distR="0" wp14:anchorId="600C27C1" wp14:editId="32C23B2F">
-            <wp:extent cx="1425384" cy="800100"/>
-            <wp:effectExtent l="0" t="0" r="0" b="0"/>
-            <wp:docPr id="216268787" name="Picture 7"/>
-            <wp:cNvGraphicFramePr>
-              <a:graphicFrameLocks xmlns:a="http://schemas.openxmlformats.org/drawingml/2006/main" noChangeAspect="1"/>
-            </wp:cNvGraphicFramePr>
-            <a:graphic xmlns:a="http://schemas.openxmlformats.org/drawingml/2006/main">
-              <a:graphicData uri="http://schemas.openxmlformats.org/drawingml/2006/picture">
-                <pic:pic xmlns:pic="http://schemas.openxmlformats.org/drawingml/2006/picture">
-                  <pic:nvPicPr>
-                    <pic:cNvPr id="0" name="Picture 4"/>
-                    <pic:cNvPicPr>
-                      <a:picLocks noChangeAspect="1" noChangeArrowheads="1"/>
-                    </pic:cNvPicPr>
-                  </pic:nvPicPr>
-                  <pic:blipFill>
-                    <a:blip r:embed="rId9" cstate="print">
-                      <a:extLst>
-                        <a:ext uri="{28A0092B-C50C-407E-A947-70E740481C1C}">
-                          <a14:useLocalDpi xmlns:a14="http://schemas.microsoft.com/office/drawing/2010/main" val="0"/>
-                        </a:ext>
-                      </a:extLst>
-                    </a:blip>
-                    <a:srcRect/>
-                    <a:stretch>
-                      <a:fillRect/>
-                    </a:stretch>
-                  </pic:blipFill>
-                  <pic:spPr bwMode="auto">
-                    <a:xfrm>
-                      <a:off x="0" y="0"/>
-                      <a:ext cx="1439379" cy="807956"/>
+                      <a:ext cx="1497045" cy="840326"/>
                     </a:xfrm>
                     <a:prstGeom prst="rect">
                       <a:avLst/>
@@ -10090,7 +9545,7 @@
           <w:sz w:val="20"/>
         </w:rPr>
       </w:pPr>
-      <w:bookmarkStart w:id="184" w:name="NNF_185_4470_249_18_0_D"/>
+      <w:bookmarkStart w:id="178" w:name="NNF_185_4470_249_18_0_D"/>
       <w:r>
         <w:rPr>
           <w:rFonts w:ascii="Cambria" w:eastAsia="Cambria" w:hAnsi="Cambria" w:cs="Cambria"/>
@@ -10115,7 +9570,17 @@
           <w:spacing w:val="49"/>
           <w:sz w:val="20"/>
         </w:rPr>
-        <w:t xml:space="preserve">    </w:t>
+        <w:t xml:space="preserve">  </w:t>
+      </w:r>
+      <w:proofErr w:type="gramStart"/>
+      <w:r>
+        <w:rPr>
+          <w:rFonts w:ascii="Cambria" w:eastAsia="Cambria" w:hAnsi="Cambria" w:cs="Cambria"/>
+          <w:b/>
+          <w:spacing w:val="49"/>
+          <w:sz w:val="20"/>
+        </w:rPr>
+        <w:t xml:space="preserve">  </w:t>
       </w:r>
       <w:r>
         <w:rPr>
@@ -10126,6 +9591,7 @@
         </w:rPr>
         <w:t>:</w:t>
       </w:r>
+      <w:proofErr w:type="gramEnd"/>
       <w:r>
         <w:rPr>
           <w:rFonts w:ascii="Cambria" w:eastAsia="Cambria" w:hAnsi="Cambria" w:cs="Cambria"/>
@@ -10160,7 +9626,17 @@
           <w:spacing w:val="49"/>
           <w:sz w:val="20"/>
         </w:rPr>
-        <w:t xml:space="preserve">   </w:t>
+        <w:t xml:space="preserve"> </w:t>
+      </w:r>
+      <w:proofErr w:type="gramStart"/>
+      <w:r>
+        <w:rPr>
+          <w:rFonts w:ascii="Cambria" w:eastAsia="Cambria" w:hAnsi="Cambria" w:cs="Cambria"/>
+          <w:b/>
+          <w:spacing w:val="49"/>
+          <w:sz w:val="20"/>
+        </w:rPr>
+        <w:t xml:space="preserve">  </w:t>
       </w:r>
       <w:r>
         <w:rPr>
@@ -10169,7 +9645,17 @@
           <w:spacing w:val="-10"/>
           <w:sz w:val="20"/>
         </w:rPr>
-        <w:t xml:space="preserve">: </w:t>
+        <w:t>:</w:t>
+      </w:r>
+      <w:proofErr w:type="gramEnd"/>
+      <w:r>
+        <w:rPr>
+          <w:rFonts w:ascii="Cambria" w:eastAsia="Cambria" w:hAnsi="Cambria" w:cs="Cambria"/>
+          <w:b/>
+          <w:spacing w:val="-10"/>
+          <w:sz w:val="20"/>
+        </w:rPr>
+        <w:t xml:space="preserve"> </w:t>
       </w:r>
       <w:r>
         <w:rPr>
@@ -10180,7 +9666,7 @@
         </w:rPr>
         <w:t>{{company.name}}</w:t>
       </w:r>
-      <w:bookmarkEnd w:id="184"/>
+      <w:bookmarkEnd w:id="178"/>
     </w:p>
     <w:p>
       <w:pPr>
@@ -10197,7 +9683,7 @@
           <w:sz w:val="20"/>
         </w:rPr>
       </w:pPr>
-      <w:bookmarkStart w:id="185" w:name="NNF_186_4470_249_18_0_D"/>
+      <w:bookmarkStart w:id="179" w:name="NNF_186_4470_249_18_0_D"/>
       <w:r>
         <w:rPr>
           <w:rFonts w:ascii="Cambria" w:eastAsia="Cambria" w:hAnsi="Cambria" w:cs="Cambria"/>
@@ -10223,7 +9709,17 @@
           <w:spacing w:val="-5"/>
           <w:sz w:val="20"/>
         </w:rPr>
-        <w:t xml:space="preserve">         </w:t>
+        <w:t xml:space="preserve">       </w:t>
+      </w:r>
+      <w:proofErr w:type="gramStart"/>
+      <w:r>
+        <w:rPr>
+          <w:rFonts w:ascii="Cambria" w:eastAsia="Cambria" w:hAnsi="Cambria" w:cs="Cambria"/>
+          <w:b/>
+          <w:spacing w:val="-5"/>
+          <w:sz w:val="20"/>
+        </w:rPr>
+        <w:t xml:space="preserve">  </w:t>
       </w:r>
       <w:r>
         <w:rPr>
@@ -10234,6 +9730,7 @@
         </w:rPr>
         <w:t>:</w:t>
       </w:r>
+      <w:proofErr w:type="gramEnd"/>
       <w:r>
         <w:rPr>
           <w:rFonts w:ascii="Cambria" w:eastAsia="Cambria" w:hAnsi="Cambria" w:cs="Cambria"/>
@@ -10286,7 +9783,17 @@
           <w:spacing w:val="-5"/>
           <w:sz w:val="20"/>
         </w:rPr>
-        <w:t xml:space="preserve">   </w:t>
+        <w:t xml:space="preserve"> </w:t>
+      </w:r>
+      <w:proofErr w:type="gramStart"/>
+      <w:r>
+        <w:rPr>
+          <w:rFonts w:ascii="Cambria" w:eastAsia="Cambria" w:hAnsi="Cambria" w:cs="Cambria"/>
+          <w:b/>
+          <w:spacing w:val="-5"/>
+          <w:sz w:val="20"/>
+        </w:rPr>
+        <w:t xml:space="preserve">  </w:t>
       </w:r>
       <w:r>
         <w:rPr>
@@ -10295,7 +9802,17 @@
           <w:spacing w:val="-10"/>
           <w:sz w:val="20"/>
         </w:rPr>
-        <w:t xml:space="preserve">: </w:t>
+        <w:t>:</w:t>
+      </w:r>
+      <w:proofErr w:type="gramEnd"/>
+      <w:r>
+        <w:rPr>
+          <w:rFonts w:ascii="Cambria" w:eastAsia="Cambria" w:hAnsi="Cambria" w:cs="Cambria"/>
+          <w:b/>
+          <w:spacing w:val="-10"/>
+          <w:sz w:val="20"/>
+        </w:rPr>
+        <w:t xml:space="preserve"> </w:t>
       </w:r>
       <w:r>
         <w:rPr>
@@ -10304,9 +9821,29 @@
           <w:spacing w:val="-10"/>
           <w:sz w:val="20"/>
         </w:rPr>
-        <w:t>{{company.registration}}</w:t>
+        <w:t>{{</w:t>
       </w:r>
-      <w:bookmarkEnd w:id="185"/>
+      <w:proofErr w:type="gramStart"/>
+      <w:r>
+        <w:rPr>
+          <w:rFonts w:ascii="Cambria" w:eastAsia="Cambria" w:hAnsi="Cambria" w:cs="Cambria"/>
+          <w:b/>
+          <w:spacing w:val="-10"/>
+          <w:sz w:val="20"/>
+        </w:rPr>
+        <w:t>company.registration</w:t>
+      </w:r>
+      <w:proofErr w:type="gramEnd"/>
+      <w:r>
+        <w:rPr>
+          <w:rFonts w:ascii="Cambria" w:eastAsia="Cambria" w:hAnsi="Cambria" w:cs="Cambria"/>
+          <w:b/>
+          <w:spacing w:val="-10"/>
+          <w:sz w:val="20"/>
+        </w:rPr>
+        <w:t>}}</w:t>
+      </w:r>
+      <w:bookmarkEnd w:id="179"/>
     </w:p>
     <w:p>
       <w:pPr>
@@ -10320,10 +9857,11 @@
         <w:rPr>
           <w:rFonts w:ascii="Cambria" w:eastAsia="Cambria" w:hAnsi="Cambria" w:cs="Cambria"/>
           <w:b/>
+          <w:spacing w:val="-10"/>
           <w:sz w:val="20"/>
         </w:rPr>
       </w:pPr>
-      <w:bookmarkStart w:id="186" w:name="NNF_187_9360_260_20_0_B"/>
+      <w:bookmarkStart w:id="180" w:name="NNF_187_9360_260_20_0_B"/>
       <w:r>
         <w:rPr>
           <w:rFonts w:ascii="Cambria" w:eastAsia="Cambria" w:hAnsi="Cambria" w:cs="Cambria"/>
@@ -10348,7 +9886,16 @@
           <w:b/>
           <w:sz w:val="20"/>
         </w:rPr>
-        <w:t xml:space="preserve">        </w:t>
+        <w:t xml:space="preserve">      </w:t>
+      </w:r>
+      <w:proofErr w:type="gramStart"/>
+      <w:r>
+        <w:rPr>
+          <w:rFonts w:ascii="Cambria" w:eastAsia="Cambria" w:hAnsi="Cambria" w:cs="Cambria"/>
+          <w:b/>
+          <w:sz w:val="20"/>
+        </w:rPr>
+        <w:t xml:space="preserve">  </w:t>
       </w:r>
       <w:r>
         <w:rPr>
@@ -10357,7 +9904,17 @@
           <w:spacing w:val="-10"/>
           <w:sz w:val="20"/>
         </w:rPr>
-        <w:t xml:space="preserve">: </w:t>
+        <w:t>:</w:t>
+      </w:r>
+      <w:proofErr w:type="gramEnd"/>
+      <w:r>
+        <w:rPr>
+          <w:rFonts w:ascii="Cambria" w:eastAsia="Cambria" w:hAnsi="Cambria" w:cs="Cambria"/>
+          <w:b/>
+          <w:spacing w:val="-10"/>
+          <w:sz w:val="20"/>
+        </w:rPr>
+        <w:t xml:space="preserve"> </w:t>
       </w:r>
       <w:r>
         <w:rPr>
@@ -10385,6 +9942,7 @@
         </w:rPr>
         <w:t>Date</w:t>
       </w:r>
+      <w:proofErr w:type="gramStart"/>
       <w:r>
         <w:rPr>
           <w:rFonts w:ascii="Cambria" w:eastAsia="Cambria" w:hAnsi="Cambria" w:cs="Cambria"/>
@@ -10401,7 +9959,17 @@
           <w:spacing w:val="-10"/>
           <w:sz w:val="20"/>
         </w:rPr>
-        <w:t xml:space="preserve">: </w:t>
+        <w:t>:</w:t>
+      </w:r>
+      <w:proofErr w:type="gramEnd"/>
+      <w:r>
+        <w:rPr>
+          <w:rFonts w:ascii="Cambria" w:eastAsia="Cambria" w:hAnsi="Cambria" w:cs="Cambria"/>
+          <w:b/>
+          <w:spacing w:val="-10"/>
+          <w:sz w:val="20"/>
+        </w:rPr>
+        <w:t xml:space="preserve"> </w:t>
       </w:r>
       <w:r>
         <w:rPr>
@@ -10412,83 +9980,15 @@
         </w:rPr>
         <w:t>{{agreement_date}}</w:t>
       </w:r>
-      <w:bookmarkEnd w:id="186"/>
-    </w:p>
-    <w:p>
-      <w:pPr>
-        <w:pStyle w:val="Heading1"/>
-        <w:tabs>
-          <w:tab w:val="left" w:pos="4550"/>
-        </w:tabs>
-        <w:rPr>
-          <w:sz w:val="20"/>
-          <w:szCs w:val="20"/>
-        </w:rPr>
-      </w:pPr>
-      <w:r>
-        <w:rPr>
-          <w:noProof/>
-        </w:rPr>
-        <w:drawing>
-          <wp:anchor distT="0" distB="0" distL="114300" distR="114300" simplePos="0" relativeHeight="251662848" behindDoc="1" locked="0" layoutInCell="1" allowOverlap="1" wp14:anchorId="24D0B2A3" wp14:editId="6036D625">
-            <wp:simplePos x="0" y="0"/>
-            <wp:positionH relativeFrom="column">
-              <wp:posOffset>4680857</wp:posOffset>
-            </wp:positionH>
-            <wp:positionV relativeFrom="page">
-              <wp:posOffset>8948057</wp:posOffset>
-            </wp:positionV>
-            <wp:extent cx="1303020" cy="730250"/>
-            <wp:effectExtent l="0" t="0" r="0" b="0"/>
-            <wp:wrapNone/>
-            <wp:docPr id="1650930967" name="Picture 1"/>
-            <wp:cNvGraphicFramePr>
-              <a:graphicFrameLocks xmlns:a="http://schemas.openxmlformats.org/drawingml/2006/main" noChangeAspect="1"/>
-            </wp:cNvGraphicFramePr>
-            <a:graphic xmlns:a="http://schemas.openxmlformats.org/drawingml/2006/main">
-              <a:graphicData uri="http://schemas.openxmlformats.org/drawingml/2006/picture">
-                <pic:pic xmlns:pic="http://schemas.openxmlformats.org/drawingml/2006/picture">
-                  <pic:nvPicPr>
-                    <pic:cNvPr id="263861726" name="Picture 1"/>
-                    <pic:cNvPicPr>
-                      <a:picLocks noChangeAspect="1"/>
-                    </pic:cNvPicPr>
-                  </pic:nvPicPr>
-                  <pic:blipFill>
-                    <a:blip r:embed="rId7" cstate="print">
-                      <a:extLst>
-                        <a:ext uri="{28A0092B-C50C-407E-A947-70E740481C1C}">
-                          <a14:useLocalDpi xmlns:a14="http://schemas.microsoft.com/office/drawing/2010/main" val="0"/>
-                        </a:ext>
-                      </a:extLst>
-                    </a:blip>
-                    <a:srcRect/>
-                    <a:stretch>
-                      <a:fillRect/>
-                    </a:stretch>
-                  </pic:blipFill>
-                  <pic:spPr bwMode="auto">
-                    <a:xfrm>
-                      <a:off x="0" y="0"/>
-                      <a:ext cx="1303020" cy="730250"/>
-                    </a:xfrm>
-                    <a:prstGeom prst="rect">
-                      <a:avLst/>
-                    </a:prstGeom>
-                    <a:noFill/>
-                    <a:ln>
-                      <a:noFill/>
-                    </a:ln>
-                  </pic:spPr>
-                </pic:pic>
-              </a:graphicData>
-            </a:graphic>
-          </wp:anchor>
-        </w:drawing>
-      </w:r>
+      <w:bookmarkEnd w:id="180"/>
     </w:p>
     <w:sectPr>
-      <w:headerReference w:type="first" r:id="rId10"/>
+      <w:headerReference w:type="even" r:id="rId9"/>
+      <w:headerReference w:type="default" r:id="rId10"/>
+      <w:footerReference w:type="even" r:id="rId11"/>
+      <w:footerReference w:type="default" r:id="rId12"/>
+      <w:headerReference w:type="first" r:id="rId13"/>
+      <w:footerReference w:type="first" r:id="rId14"/>
       <w:type w:val="continuous"/>
       <w:pgSz w:w="12240" w:h="15840"/>
       <w:pgMar w:top="1040" w:right="1080" w:bottom="280" w:left="1440" w:header="1300" w:footer="720" w:gutter="0"/>
@@ -10518,6 +10018,36 @@
 </w:endnotes>
 </file>
 
+<file path=word/footer1.xml><?xml version="1.0" encoding="utf-8"?>
+<w:ftr xmlns:wpc="http://schemas.microsoft.com/office/word/2010/wordprocessingCanvas" xmlns:cx="http://schemas.microsoft.com/office/drawing/2014/chartex" xmlns:cx1="http://schemas.microsoft.com/office/drawing/2015/9/8/chartex" xmlns:cx2="http://schemas.microsoft.com/office/drawing/2015/10/21/chartex" xmlns:cx3="http://schemas.microsoft.com/office/drawing/2016/5/9/chartex" xmlns:cx4="http://schemas.microsoft.com/office/drawing/2016/5/10/chartex" xmlns:cx5="http://schemas.microsoft.com/office/drawing/2016/5/11/chartex" xmlns:cx6="http://schemas.microsoft.com/office/drawing/2016/5/12/chartex" xmlns:cx7="http://schemas.microsoft.com/office/drawing/2016/5/13/chartex" xmlns:cx8="http://schemas.microsoft.com/office/drawing/2016/5/14/chartex" xmlns:mc="http://schemas.openxmlformats.org/markup-compatibility/2006" xmlns:aink="http://schemas.microsoft.com/office/drawing/2016/ink" xmlns:am3d="http://schemas.microsoft.com/office/drawing/2017/model3d" xmlns:o="urn:schemas-microsoft-com:office:office" xmlns:oel="http://schemas.microsoft.com/office/2019/extlst" xmlns:r="http://schemas.openxmlformats.org/officeDocument/2006/relationships" xmlns:m="http://schemas.openxmlformats.org/officeDocument/2006/math" xmlns:v="urn:schemas-microsoft-com:vml" xmlns:wp14="http://schemas.microsoft.com/office/word/2010/wordprocessingDrawing" xmlns:wp="http://schemas.openxmlformats.org/drawingml/2006/wordprocessingDrawing" xmlns:w10="urn:schemas-microsoft-com:office:word" xmlns:w="http://schemas.openxmlformats.org/wordprocessingml/2006/main" xmlns:w14="http://schemas.microsoft.com/office/word/2010/wordml" xmlns:w15="http://schemas.microsoft.com/office/word/2012/wordml" xmlns:w16cex="http://schemas.microsoft.com/office/word/2018/wordml/cex" xmlns:w16cid="http://schemas.microsoft.com/office/word/2016/wordml/cid" xmlns:w16="http://schemas.microsoft.com/office/word/2018/wordml" xmlns:w16du="http://schemas.microsoft.com/office/word/2023/wordml/word16du" xmlns:w16sdtdh="http://schemas.microsoft.com/office/word/2020/wordml/sdtdatahash" xmlns:w16sdtfl="http://schemas.microsoft.com/office/word/2024/wordml/sdtformatlock" xmlns:w16se="http://schemas.microsoft.com/office/word/2015/wordml/symex" xmlns:wpg="http://schemas.microsoft.com/office/word/2010/wordprocessingGroup" xmlns:wpi="http://schemas.microsoft.com/office/word/2010/wordprocessingInk" xmlns:wne="http://schemas.microsoft.com/office/word/2006/wordml" xmlns:wps="http://schemas.microsoft.com/office/word/2010/wordprocessingShape" mc:Ignorable="w14 w15 w16se w16cid w16 w16cex w16sdtdh w16sdtfl w16du wp14">
+  <w:p>
+    <w:pPr>
+      <w:pStyle w:val="Footer"/>
+    </w:pPr>
+  </w:p>
+</w:ftr>
+</file>
+
+<file path=word/footer2.xml><?xml version="1.0" encoding="utf-8"?>
+<w:ftr xmlns:wpc="http://schemas.microsoft.com/office/word/2010/wordprocessingCanvas" xmlns:cx="http://schemas.microsoft.com/office/drawing/2014/chartex" xmlns:cx1="http://schemas.microsoft.com/office/drawing/2015/9/8/chartex" xmlns:cx2="http://schemas.microsoft.com/office/drawing/2015/10/21/chartex" xmlns:cx3="http://schemas.microsoft.com/office/drawing/2016/5/9/chartex" xmlns:cx4="http://schemas.microsoft.com/office/drawing/2016/5/10/chartex" xmlns:cx5="http://schemas.microsoft.com/office/drawing/2016/5/11/chartex" xmlns:cx6="http://schemas.microsoft.com/office/drawing/2016/5/12/chartex" xmlns:cx7="http://schemas.microsoft.com/office/drawing/2016/5/13/chartex" xmlns:cx8="http://schemas.microsoft.com/office/drawing/2016/5/14/chartex" xmlns:mc="http://schemas.openxmlformats.org/markup-compatibility/2006" xmlns:aink="http://schemas.microsoft.com/office/drawing/2016/ink" xmlns:am3d="http://schemas.microsoft.com/office/drawing/2017/model3d" xmlns:o="urn:schemas-microsoft-com:office:office" xmlns:oel="http://schemas.microsoft.com/office/2019/extlst" xmlns:r="http://schemas.openxmlformats.org/officeDocument/2006/relationships" xmlns:m="http://schemas.openxmlformats.org/officeDocument/2006/math" xmlns:v="urn:schemas-microsoft-com:vml" xmlns:wp14="http://schemas.microsoft.com/office/word/2010/wordprocessingDrawing" xmlns:wp="http://schemas.openxmlformats.org/drawingml/2006/wordprocessingDrawing" xmlns:w10="urn:schemas-microsoft-com:office:word" xmlns:w="http://schemas.openxmlformats.org/wordprocessingml/2006/main" xmlns:w14="http://schemas.microsoft.com/office/word/2010/wordml" xmlns:w15="http://schemas.microsoft.com/office/word/2012/wordml" xmlns:w16cex="http://schemas.microsoft.com/office/word/2018/wordml/cex" xmlns:w16cid="http://schemas.microsoft.com/office/word/2016/wordml/cid" xmlns:w16="http://schemas.microsoft.com/office/word/2018/wordml" xmlns:w16du="http://schemas.microsoft.com/office/word/2023/wordml/word16du" xmlns:w16sdtdh="http://schemas.microsoft.com/office/word/2020/wordml/sdtdatahash" xmlns:w16sdtfl="http://schemas.microsoft.com/office/word/2024/wordml/sdtformatlock" xmlns:w16se="http://schemas.microsoft.com/office/word/2015/wordml/symex" xmlns:wpg="http://schemas.microsoft.com/office/word/2010/wordprocessingGroup" xmlns:wpi="http://schemas.microsoft.com/office/word/2010/wordprocessingInk" xmlns:wne="http://schemas.microsoft.com/office/word/2006/wordml" xmlns:wps="http://schemas.microsoft.com/office/word/2010/wordprocessingShape" mc:Ignorable="w14 w15 w16se w16cid w16 w16cex w16sdtdh w16sdtfl w16du wp14">
+  <w:p>
+    <w:pPr>
+      <w:pStyle w:val="Footer"/>
+    </w:pPr>
+  </w:p>
+</w:ftr>
+</file>
+
+<file path=word/footer3.xml><?xml version="1.0" encoding="utf-8"?>
+<w:ftr xmlns:wpc="http://schemas.microsoft.com/office/word/2010/wordprocessingCanvas" xmlns:cx="http://schemas.microsoft.com/office/drawing/2014/chartex" xmlns:cx1="http://schemas.microsoft.com/office/drawing/2015/9/8/chartex" xmlns:cx2="http://schemas.microsoft.com/office/drawing/2015/10/21/chartex" xmlns:cx3="http://schemas.microsoft.com/office/drawing/2016/5/9/chartex" xmlns:cx4="http://schemas.microsoft.com/office/drawing/2016/5/10/chartex" xmlns:cx5="http://schemas.microsoft.com/office/drawing/2016/5/11/chartex" xmlns:cx6="http://schemas.microsoft.com/office/drawing/2016/5/12/chartex" xmlns:cx7="http://schemas.microsoft.com/office/drawing/2016/5/13/chartex" xmlns:cx8="http://schemas.microsoft.com/office/drawing/2016/5/14/chartex" xmlns:mc="http://schemas.openxmlformats.org/markup-compatibility/2006" xmlns:aink="http://schemas.microsoft.com/office/drawing/2016/ink" xmlns:am3d="http://schemas.microsoft.com/office/drawing/2017/model3d" xmlns:o="urn:schemas-microsoft-com:office:office" xmlns:oel="http://schemas.microsoft.com/office/2019/extlst" xmlns:r="http://schemas.openxmlformats.org/officeDocument/2006/relationships" xmlns:m="http://schemas.openxmlformats.org/officeDocument/2006/math" xmlns:v="urn:schemas-microsoft-com:vml" xmlns:wp14="http://schemas.microsoft.com/office/word/2010/wordprocessingDrawing" xmlns:wp="http://schemas.openxmlformats.org/drawingml/2006/wordprocessingDrawing" xmlns:w10="urn:schemas-microsoft-com:office:word" xmlns:w="http://schemas.openxmlformats.org/wordprocessingml/2006/main" xmlns:w14="http://schemas.microsoft.com/office/word/2010/wordml" xmlns:w15="http://schemas.microsoft.com/office/word/2012/wordml" xmlns:w16cex="http://schemas.microsoft.com/office/word/2018/wordml/cex" xmlns:w16cid="http://schemas.microsoft.com/office/word/2016/wordml/cid" xmlns:w16="http://schemas.microsoft.com/office/word/2018/wordml" xmlns:w16du="http://schemas.microsoft.com/office/word/2023/wordml/word16du" xmlns:w16sdtdh="http://schemas.microsoft.com/office/word/2020/wordml/sdtdatahash" xmlns:w16sdtfl="http://schemas.microsoft.com/office/word/2024/wordml/sdtformatlock" xmlns:w16se="http://schemas.microsoft.com/office/word/2015/wordml/symex" xmlns:wpg="http://schemas.microsoft.com/office/word/2010/wordprocessingGroup" xmlns:wpi="http://schemas.microsoft.com/office/word/2010/wordprocessingInk" xmlns:wne="http://schemas.microsoft.com/office/word/2006/wordml" xmlns:wps="http://schemas.microsoft.com/office/word/2010/wordprocessingShape" mc:Ignorable="w14 w15 w16se w16cid w16 w16cex w16sdtdh w16sdtfl w16du wp14">
+  <w:p>
+    <w:pPr>
+      <w:pStyle w:val="Footer"/>
+    </w:pPr>
+  </w:p>
+</w:ftr>
+</file>
+
 <file path=word/footnotes.xml><?xml version="1.0" encoding="utf-8"?>
 <w:footnotes xmlns:wpc="http://schemas.microsoft.com/office/word/2010/wordprocessingCanvas" xmlns:cx="http://schemas.microsoft.com/office/drawing/2014/chartex" xmlns:cx1="http://schemas.microsoft.com/office/drawing/2015/9/8/chartex" xmlns:cx2="http://schemas.microsoft.com/office/drawing/2015/10/21/chartex" xmlns:cx3="http://schemas.microsoft.com/office/drawing/2016/5/9/chartex" xmlns:cx4="http://schemas.microsoft.com/office/drawing/2016/5/10/chartex" xmlns:cx5="http://schemas.microsoft.com/office/drawing/2016/5/11/chartex" xmlns:cx6="http://schemas.microsoft.com/office/drawing/2016/5/12/chartex" xmlns:cx7="http://schemas.microsoft.com/office/drawing/2016/5/13/chartex" xmlns:cx8="http://schemas.microsoft.com/office/drawing/2016/5/14/chartex" xmlns:mc="http://schemas.openxmlformats.org/markup-compatibility/2006" xmlns:aink="http://schemas.microsoft.com/office/drawing/2016/ink" xmlns:am3d="http://schemas.microsoft.com/office/drawing/2017/model3d" xmlns:o="urn:schemas-microsoft-com:office:office" xmlns:oel="http://schemas.microsoft.com/office/2019/extlst" xmlns:r="http://schemas.openxmlformats.org/officeDocument/2006/relationships" xmlns:m="http://schemas.openxmlformats.org/officeDocument/2006/math" xmlns:v="urn:schemas-microsoft-com:vml" xmlns:wp14="http://schemas.microsoft.com/office/word/2010/wordprocessingDrawing" xmlns:wp="http://schemas.openxmlformats.org/drawingml/2006/wordprocessingDrawing" xmlns:w10="urn:schemas-microsoft-com:office:word" xmlns:w="http://schemas.openxmlformats.org/wordprocessingml/2006/main" xmlns:w14="http://schemas.microsoft.com/office/word/2010/wordml" xmlns:w15="http://schemas.microsoft.com/office/word/2012/wordml" xmlns:w16cex="http://schemas.microsoft.com/office/word/2018/wordml/cex" xmlns:w16cid="http://schemas.microsoft.com/office/word/2016/wordml/cid" xmlns:w16="http://schemas.microsoft.com/office/word/2018/wordml" xmlns:w16du="http://schemas.microsoft.com/office/word/2023/wordml/word16du" xmlns:w16sdtdh="http://schemas.microsoft.com/office/word/2020/wordml/sdtdatahash" xmlns:w16sdtfl="http://schemas.microsoft.com/office/word/2024/wordml/sdtformatlock" xmlns:w16se="http://schemas.microsoft.com/office/word/2015/wordml/symex" xmlns:wpg="http://schemas.microsoft.com/office/word/2010/wordprocessingGroup" xmlns:wpi="http://schemas.microsoft.com/office/word/2010/wordprocessingInk" xmlns:wne="http://schemas.microsoft.com/office/word/2006/wordml" xmlns:wps="http://schemas.microsoft.com/office/word/2010/wordprocessingShape" mc:Ignorable="w14 w15 w16se w16cid w16 w16cex w16sdtdh w16sdtfl w16du wp14">
   <w:footnote w:type="separator" w:id="-1">
@@ -10541,122 +10071,257 @@
 <w:hdr xmlns:wpc="http://schemas.microsoft.com/office/word/2010/wordprocessingCanvas" xmlns:cx="http://schemas.microsoft.com/office/drawing/2014/chartex" xmlns:cx1="http://schemas.microsoft.com/office/drawing/2015/9/8/chartex" xmlns:cx2="http://schemas.microsoft.com/office/drawing/2015/10/21/chartex" xmlns:cx3="http://schemas.microsoft.com/office/drawing/2016/5/9/chartex" xmlns:cx4="http://schemas.microsoft.com/office/drawing/2016/5/10/chartex" xmlns:cx5="http://schemas.microsoft.com/office/drawing/2016/5/11/chartex" xmlns:cx6="http://schemas.microsoft.com/office/drawing/2016/5/12/chartex" xmlns:cx7="http://schemas.microsoft.com/office/drawing/2016/5/13/chartex" xmlns:cx8="http://schemas.microsoft.com/office/drawing/2016/5/14/chartex" xmlns:mc="http://schemas.openxmlformats.org/markup-compatibility/2006" xmlns:aink="http://schemas.microsoft.com/office/drawing/2016/ink" xmlns:am3d="http://schemas.microsoft.com/office/drawing/2017/model3d" xmlns:o="urn:schemas-microsoft-com:office:office" xmlns:oel="http://schemas.microsoft.com/office/2019/extlst" xmlns:r="http://schemas.openxmlformats.org/officeDocument/2006/relationships" xmlns:m="http://schemas.openxmlformats.org/officeDocument/2006/math" xmlns:v="urn:schemas-microsoft-com:vml" xmlns:wp14="http://schemas.microsoft.com/office/word/2010/wordprocessingDrawing" xmlns:wp="http://schemas.openxmlformats.org/drawingml/2006/wordprocessingDrawing" xmlns:w10="urn:schemas-microsoft-com:office:word" xmlns:w="http://schemas.openxmlformats.org/wordprocessingml/2006/main" xmlns:w14="http://schemas.microsoft.com/office/word/2010/wordml" xmlns:w15="http://schemas.microsoft.com/office/word/2012/wordml" xmlns:w16cex="http://schemas.microsoft.com/office/word/2018/wordml/cex" xmlns:w16cid="http://schemas.microsoft.com/office/word/2016/wordml/cid" xmlns:w16="http://schemas.microsoft.com/office/word/2018/wordml" xmlns:w16du="http://schemas.microsoft.com/office/word/2023/wordml/word16du" xmlns:w16sdtdh="http://schemas.microsoft.com/office/word/2020/wordml/sdtdatahash" xmlns:w16sdtfl="http://schemas.microsoft.com/office/word/2024/wordml/sdtformatlock" xmlns:w16se="http://schemas.microsoft.com/office/word/2015/wordml/symex" xmlns:wpg="http://schemas.microsoft.com/office/word/2010/wordprocessingGroup" xmlns:wpi="http://schemas.microsoft.com/office/word/2010/wordprocessingInk" xmlns:wne="http://schemas.microsoft.com/office/word/2006/wordml" xmlns:wps="http://schemas.microsoft.com/office/word/2010/wordprocessingShape" mc:Ignorable="w14 w15 w16se w16cid w16 w16cex w16sdtdh w16sdtfl w16du wp14">
   <w:p>
     <w:pPr>
-      <w:spacing w:after="200"/>
-      <w:jc w:val="center"/>
+      <w:pStyle w:val="Header"/>
     </w:pPr>
-    <w:r>
-      <w:rPr>
-        <w:noProof/>
-      </w:rPr>
-      <w:drawing>
-        <wp:inline distT="0" distB="0" distL="0" distR="0" wp14:anchorId="66186BA8" wp14:editId="51E7063D">
-          <wp:extent cx="889000" cy="762000"/>
-          <wp:effectExtent l="0" t="0" r="0" b="0"/>
-          <wp:docPr id="906555684" name="Picture 906555684"/>
-          <wp:cNvGraphicFramePr>
-            <a:graphicFrameLocks xmlns:a="http://schemas.openxmlformats.org/drawingml/2006/main" noChangeAspect="1"/>
-          </wp:cNvGraphicFramePr>
-          <a:graphic xmlns:a="http://schemas.openxmlformats.org/drawingml/2006/main">
-            <a:graphicData uri="http://schemas.openxmlformats.org/drawingml/2006/picture">
-              <pic:pic xmlns:pic="http://schemas.openxmlformats.org/drawingml/2006/picture">
-                <pic:nvPicPr>
-                  <pic:cNvPr id="0" name="business_card.jpg"/>
-                  <pic:cNvPicPr/>
-                </pic:nvPicPr>
-                <pic:blipFill>
-                  <a:blip r:embed="rId1"/>
-                  <a:srcRect l="67619" t="16667" r="6190" b="44167"/>
-                  <a:stretch>
-                    <a:fillRect/>
-                  </a:stretch>
-                </pic:blipFill>
-                <pic:spPr>
-                  <a:xfrm>
-                    <a:off x="0" y="0"/>
-                    <a:ext cx="889000" cy="762000"/>
-                  </a:xfrm>
-                  <a:prstGeom prst="rect">
-                    <a:avLst/>
-                  </a:prstGeom>
-                </pic:spPr>
-              </pic:pic>
-            </a:graphicData>
-          </a:graphic>
-        </wp:inline>
-      </w:drawing>
-    </w:r>
   </w:p>
+</w:hdr>
+</file>
+
+<file path=word/header2.xml><?xml version="1.0" encoding="utf-8"?>
+<w:hdr xmlns:wpc="http://schemas.microsoft.com/office/word/2010/wordprocessingCanvas" xmlns:cx="http://schemas.microsoft.com/office/drawing/2014/chartex" xmlns:cx1="http://schemas.microsoft.com/office/drawing/2015/9/8/chartex" xmlns:cx2="http://schemas.microsoft.com/office/drawing/2015/10/21/chartex" xmlns:cx3="http://schemas.microsoft.com/office/drawing/2016/5/9/chartex" xmlns:cx4="http://schemas.microsoft.com/office/drawing/2016/5/10/chartex" xmlns:cx5="http://schemas.microsoft.com/office/drawing/2016/5/11/chartex" xmlns:cx6="http://schemas.microsoft.com/office/drawing/2016/5/12/chartex" xmlns:cx7="http://schemas.microsoft.com/office/drawing/2016/5/13/chartex" xmlns:cx8="http://schemas.microsoft.com/office/drawing/2016/5/14/chartex" xmlns:mc="http://schemas.openxmlformats.org/markup-compatibility/2006" xmlns:aink="http://schemas.microsoft.com/office/drawing/2016/ink" xmlns:am3d="http://schemas.microsoft.com/office/drawing/2017/model3d" xmlns:o="urn:schemas-microsoft-com:office:office" xmlns:oel="http://schemas.microsoft.com/office/2019/extlst" xmlns:r="http://schemas.openxmlformats.org/officeDocument/2006/relationships" xmlns:m="http://schemas.openxmlformats.org/officeDocument/2006/math" xmlns:v="urn:schemas-microsoft-com:vml" xmlns:wp14="http://schemas.microsoft.com/office/word/2010/wordprocessingDrawing" xmlns:wp="http://schemas.openxmlformats.org/drawingml/2006/wordprocessingDrawing" xmlns:w10="urn:schemas-microsoft-com:office:word" xmlns:w="http://schemas.openxmlformats.org/wordprocessingml/2006/main" xmlns:w14="http://schemas.microsoft.com/office/word/2010/wordml" xmlns:w15="http://schemas.microsoft.com/office/word/2012/wordml" xmlns:w16cex="http://schemas.microsoft.com/office/word/2018/wordml/cex" xmlns:w16cid="http://schemas.microsoft.com/office/word/2016/wordml/cid" xmlns:w16="http://schemas.microsoft.com/office/word/2018/wordml" xmlns:w16du="http://schemas.microsoft.com/office/word/2023/wordml/word16du" xmlns:w16sdtdh="http://schemas.microsoft.com/office/word/2020/wordml/sdtdatahash" xmlns:w16sdtfl="http://schemas.microsoft.com/office/word/2024/wordml/sdtformatlock" xmlns:w16se="http://schemas.microsoft.com/office/word/2015/wordml/symex" xmlns:wpg="http://schemas.microsoft.com/office/word/2010/wordprocessingGroup" xmlns:wpi="http://schemas.microsoft.com/office/word/2010/wordprocessingInk" xmlns:wne="http://schemas.microsoft.com/office/word/2006/wordml" xmlns:wps="http://schemas.microsoft.com/office/word/2010/wordprocessingShape" mc:Ignorable="w14 w15 w16se w16cid w16 w16cex w16sdtdh w16sdtfl w16du wp14">
   <w:p>
     <w:pPr>
-      <w:spacing w:after="40"/>
-      <w:jc w:val="center"/>
+      <w:pStyle w:val="Header"/>
     </w:pPr>
-    <w:bookmarkStart w:id="187" w:name="NestHeader_name"/>
-    <w:bookmarkStart w:id="188" w:name="NNF_188_9720_272_22_1_S"/>
-    <w:r>
-      <w:rPr>
-        <w:rFonts w:ascii="Arial" w:hAnsi="Arial"/>
-        <w:b/>
-      </w:rPr>
-      <w:t>{{company.name}}</w:t>
-    </w:r>
-    <w:bookmarkEnd w:id="187"/>
-    <w:bookmarkEnd w:id="188"/>
   </w:p>
-  <w:p>
-    <w:pPr>
-      <w:spacing w:after="40"/>
-      <w:jc w:val="center"/>
-    </w:pPr>
-    <w:bookmarkStart w:id="189" w:name="NestHeader_registration"/>
-    <w:bookmarkStart w:id="190" w:name="NNF_189_9720_294_24_1_S"/>
-    <w:r>
-      <w:rPr>
-        <w:rFonts w:ascii="Arial" w:hAnsi="Arial"/>
-        <w:b/>
-        <w:sz w:val="24"/>
-      </w:rPr>
-      <w:t>{{company.registration}}</w:t>
-    </w:r>
-    <w:bookmarkEnd w:id="189"/>
-    <w:bookmarkEnd w:id="190"/>
-  </w:p>
-  <w:p>
-    <w:pPr>
-      <w:spacing w:after="40"/>
-      <w:jc w:val="center"/>
-    </w:pPr>
-    <w:bookmarkStart w:id="191" w:name="NestHeader_address"/>
-    <w:bookmarkStart w:id="192" w:name="NNF_190_9720_260_21_1_T"/>
-    <w:r>
-      <w:rPr>
-        <w:rFonts w:ascii="Times New Roman" w:hAnsi="Times New Roman"/>
-        <w:b/>
-        <w:sz w:val="21"/>
-      </w:rPr>
-      <w:t>{{company.address}}</w:t>
-    </w:r>
-    <w:bookmarkEnd w:id="191"/>
-    <w:bookmarkEnd w:id="192"/>
-  </w:p>
-  <w:p>
-    <w:pPr>
-      <w:spacing w:after="40"/>
-      <w:jc w:val="center"/>
-    </w:pPr>
-    <w:bookmarkStart w:id="193" w:name="NestHeader_phone"/>
-    <w:bookmarkStart w:id="194" w:name="NNF_191_9720_281_23_1_T"/>
-    <w:r>
-      <w:rPr>
-        <w:rFonts w:ascii="Times New Roman" w:hAnsi="Times New Roman"/>
-        <w:b/>
-        <w:sz w:val="23"/>
-      </w:rPr>
-      <w:t>TEL NO.: {{company.phone}}</w:t>
-    </w:r>
-    <w:bookmarkEnd w:id="193"/>
-    <w:bookmarkEnd w:id="194"/>
-  </w:p>
+</w:hdr>
+</file>
+
+<file path=word/header3.xml><?xml version="1.0" encoding="utf-8"?>
+<w:hdr xmlns:wpc="http://schemas.microsoft.com/office/word/2010/wordprocessingCanvas" xmlns:cx="http://schemas.microsoft.com/office/drawing/2014/chartex" xmlns:cx1="http://schemas.microsoft.com/office/drawing/2015/9/8/chartex" xmlns:cx2="http://schemas.microsoft.com/office/drawing/2015/10/21/chartex" xmlns:cx3="http://schemas.microsoft.com/office/drawing/2016/5/9/chartex" xmlns:cx4="http://schemas.microsoft.com/office/drawing/2016/5/10/chartex" xmlns:cx5="http://schemas.microsoft.com/office/drawing/2016/5/11/chartex" xmlns:cx6="http://schemas.microsoft.com/office/drawing/2016/5/12/chartex" xmlns:cx7="http://schemas.microsoft.com/office/drawing/2016/5/13/chartex" xmlns:cx8="http://schemas.microsoft.com/office/drawing/2016/5/14/chartex" xmlns:mc="http://schemas.openxmlformats.org/markup-compatibility/2006" xmlns:aink="http://schemas.microsoft.com/office/drawing/2016/ink" xmlns:am3d="http://schemas.microsoft.com/office/drawing/2017/model3d" xmlns:o="urn:schemas-microsoft-com:office:office" xmlns:oel="http://schemas.microsoft.com/office/2019/extlst" xmlns:r="http://schemas.openxmlformats.org/officeDocument/2006/relationships" xmlns:m="http://schemas.openxmlformats.org/officeDocument/2006/math" xmlns:v="urn:schemas-microsoft-com:vml" xmlns:wp14="http://schemas.microsoft.com/office/word/2010/wordprocessingDrawing" xmlns:wp="http://schemas.openxmlformats.org/drawingml/2006/wordprocessingDrawing" xmlns:w10="urn:schemas-microsoft-com:office:word" xmlns:w="http://schemas.openxmlformats.org/wordprocessingml/2006/main" xmlns:w14="http://schemas.microsoft.com/office/word/2010/wordml" xmlns:w15="http://schemas.microsoft.com/office/word/2012/wordml" xmlns:w16cex="http://schemas.microsoft.com/office/word/2018/wordml/cex" xmlns:w16cid="http://schemas.microsoft.com/office/word/2016/wordml/cid" xmlns:w16="http://schemas.microsoft.com/office/word/2018/wordml" xmlns:w16du="http://schemas.microsoft.com/office/word/2023/wordml/word16du" xmlns:w16sdtdh="http://schemas.microsoft.com/office/word/2020/wordml/sdtdatahash" xmlns:w16sdtfl="http://schemas.microsoft.com/office/word/2024/wordml/sdtformatlock" xmlns:w16se="http://schemas.microsoft.com/office/word/2015/wordml/symex" xmlns:wpg="http://schemas.microsoft.com/office/word/2010/wordprocessingGroup" xmlns:wpi="http://schemas.microsoft.com/office/word/2010/wordprocessingInk" xmlns:wne="http://schemas.microsoft.com/office/word/2006/wordml" xmlns:wps="http://schemas.microsoft.com/office/word/2010/wordprocessingShape" mc:Ignorable="w14 w15 w16se w16cid w16 w16cex w16sdtdh w16sdtfl w16du wp14">
+  <w:tbl>
+    <w:tblPr>
+      <w:tblStyle w:val="TableGrid"/>
+      <w:tblW w:w="0" w:type="auto"/>
+      <w:tblLook w:val="04A0" w:firstRow="1" w:lastRow="0" w:firstColumn="1" w:lastColumn="0" w:noHBand="0" w:noVBand="1"/>
+    </w:tblPr>
+    <w:tblGrid>
+      <w:gridCol w:w="4968"/>
+      <w:gridCol w:w="4968"/>
+    </w:tblGrid>
+    <w:tr>
+      <w:trPr>
+        <w:trHeight w:val="900"/>
+      </w:trPr>
+      <w:tc>
+        <w:tcPr>
+          <w:tcW w:w="4968" w:type="dxa"/>
+          <w:tcBorders>
+            <w:top w:val="nil"/>
+            <w:left w:val="nil"/>
+            <w:bottom w:val="nil"/>
+            <w:right w:val="nil"/>
+          </w:tcBorders>
+        </w:tcPr>
+        <w:p>
+          <w:pPr>
+            <w:spacing w:after="200"/>
+            <w:jc w:val="right"/>
+          </w:pPr>
+          <w:r>
+            <w:rPr>
+              <w:noProof/>
+            </w:rPr>
+            <w:drawing>
+              <wp:inline distT="0" distB="0" distL="0" distR="0" wp14:anchorId="22B660BF" wp14:editId="6000975A">
+                <wp:extent cx="511629" cy="438538"/>
+                <wp:effectExtent l="0" t="0" r="3175" b="0"/>
+                <wp:docPr id="906555684" name="Picture 906555684"/>
+                <wp:cNvGraphicFramePr>
+                  <a:graphicFrameLocks xmlns:a="http://schemas.openxmlformats.org/drawingml/2006/main" noChangeAspect="1"/>
+                </wp:cNvGraphicFramePr>
+                <a:graphic xmlns:a="http://schemas.openxmlformats.org/drawingml/2006/main">
+                  <a:graphicData uri="http://schemas.openxmlformats.org/drawingml/2006/picture">
+                    <pic:pic xmlns:pic="http://schemas.openxmlformats.org/drawingml/2006/picture">
+                      <pic:nvPicPr>
+                        <pic:cNvPr id="0" name="business_card.jpg"/>
+                        <pic:cNvPicPr/>
+                      </pic:nvPicPr>
+                      <pic:blipFill>
+                        <a:blip r:embed="rId1"/>
+                        <a:srcRect l="67619" t="16667" r="6190" b="44167"/>
+                        <a:stretch>
+                          <a:fillRect/>
+                        </a:stretch>
+                      </pic:blipFill>
+                      <pic:spPr>
+                        <a:xfrm>
+                          <a:off x="0" y="0"/>
+                          <a:ext cx="551121" cy="472388"/>
+                        </a:xfrm>
+                        <a:prstGeom prst="rect">
+                          <a:avLst/>
+                        </a:prstGeom>
+                      </pic:spPr>
+                    </pic:pic>
+                  </a:graphicData>
+                </a:graphic>
+              </wp:inline>
+            </w:drawing>
+          </w:r>
+        </w:p>
+      </w:tc>
+      <w:tc>
+        <w:tcPr>
+          <w:tcW w:w="4968" w:type="dxa"/>
+          <w:tcBorders>
+            <w:top w:val="nil"/>
+            <w:left w:val="nil"/>
+            <w:bottom w:val="nil"/>
+            <w:right w:val="nil"/>
+          </w:tcBorders>
+        </w:tcPr>
+        <w:p>
+          <w:pPr>
+            <w:spacing w:after="40"/>
+            <w:rPr>
+              <w:sz w:val="16"/>
+              <w:szCs w:val="16"/>
+            </w:rPr>
+          </w:pPr>
+          <w:bookmarkStart w:id="181" w:name="NestHeader_name"/>
+          <w:bookmarkStart w:id="182" w:name="NNF_188_9720_272_22_1_S"/>
+          <w:r>
+            <w:rPr>
+              <w:rFonts w:ascii="Arial" w:hAnsi="Arial"/>
+              <w:b/>
+              <w:sz w:val="16"/>
+              <w:szCs w:val="16"/>
+            </w:rPr>
+            <w:t>{{company.name}}</w:t>
+          </w:r>
+          <w:bookmarkEnd w:id="181"/>
+          <w:bookmarkEnd w:id="182"/>
+        </w:p>
+        <w:p>
+          <w:pPr>
+            <w:spacing w:after="40"/>
+            <w:rPr>
+              <w:sz w:val="14"/>
+              <w:szCs w:val="14"/>
+            </w:rPr>
+          </w:pPr>
+          <w:bookmarkStart w:id="183" w:name="NestHeader_registration"/>
+          <w:bookmarkStart w:id="184" w:name="NNF_189_9720_294_24_1_S"/>
+          <w:r>
+            <w:rPr>
+              <w:rFonts w:ascii="Arial" w:hAnsi="Arial"/>
+              <w:b/>
+              <w:sz w:val="16"/>
+              <w:szCs w:val="14"/>
+            </w:rPr>
+            <w:t>{{</w:t>
+          </w:r>
+          <w:proofErr w:type="gramStart"/>
+          <w:r>
+            <w:rPr>
+              <w:rFonts w:ascii="Arial" w:hAnsi="Arial"/>
+              <w:b/>
+              <w:sz w:val="16"/>
+              <w:szCs w:val="14"/>
+            </w:rPr>
+            <w:t>company.registration</w:t>
+          </w:r>
+          <w:proofErr w:type="gramEnd"/>
+          <w:r>
+            <w:rPr>
+              <w:rFonts w:ascii="Arial" w:hAnsi="Arial"/>
+              <w:b/>
+              <w:sz w:val="16"/>
+              <w:szCs w:val="14"/>
+            </w:rPr>
+            <w:t>}}</w:t>
+          </w:r>
+          <w:bookmarkEnd w:id="183"/>
+          <w:bookmarkEnd w:id="184"/>
+        </w:p>
+        <w:p>
+          <w:pPr>
+            <w:spacing w:after="40"/>
+            <w:rPr>
+              <w:sz w:val="16"/>
+              <w:szCs w:val="16"/>
+            </w:rPr>
+          </w:pPr>
+          <w:bookmarkStart w:id="185" w:name="NestHeader_address"/>
+          <w:bookmarkStart w:id="186" w:name="NNF_190_9720_260_21_1_T"/>
+          <w:r>
+            <w:rPr>
+              <w:rFonts w:ascii="Times New Roman" w:hAnsi="Times New Roman"/>
+              <w:b/>
+              <w:sz w:val="16"/>
+              <w:szCs w:val="16"/>
+            </w:rPr>
+            <w:t>{{</w:t>
+          </w:r>
+          <w:proofErr w:type="gramStart"/>
+          <w:r>
+            <w:rPr>
+              <w:rFonts w:ascii="Times New Roman" w:hAnsi="Times New Roman"/>
+              <w:b/>
+              <w:sz w:val="16"/>
+              <w:szCs w:val="16"/>
+            </w:rPr>
+            <w:t>company.address</w:t>
+          </w:r>
+          <w:proofErr w:type="gramEnd"/>
+          <w:r>
+            <w:rPr>
+              <w:rFonts w:ascii="Times New Roman" w:hAnsi="Times New Roman"/>
+              <w:b/>
+              <w:sz w:val="16"/>
+              <w:szCs w:val="16"/>
+            </w:rPr>
+            <w:t>}}</w:t>
+          </w:r>
+          <w:bookmarkEnd w:id="185"/>
+          <w:bookmarkEnd w:id="186"/>
+        </w:p>
+        <w:p>
+          <w:pPr>
+            <w:spacing w:after="40"/>
+            <w:rPr>
+              <w:sz w:val="16"/>
+              <w:szCs w:val="16"/>
+            </w:rPr>
+          </w:pPr>
+          <w:bookmarkStart w:id="187" w:name="NestHeader_phone"/>
+          <w:bookmarkStart w:id="188" w:name="NNF_191_9720_281_23_1_T"/>
+          <w:r>
+            <w:rPr>
+              <w:rFonts w:ascii="Times New Roman" w:hAnsi="Times New Roman"/>
+              <w:b/>
+              <w:sz w:val="16"/>
+              <w:szCs w:val="14"/>
+            </w:rPr>
+            <w:t>TEL NO</w:t>
+          </w:r>
+          <w:proofErr w:type="gramStart"/>
+          <w:r>
+            <w:rPr>
+              <w:rFonts w:ascii="Times New Roman" w:hAnsi="Times New Roman"/>
+              <w:b/>
+              <w:sz w:val="16"/>
+              <w:szCs w:val="14"/>
+            </w:rPr>
+            <w:t>.: {{company.phone</w:t>
+          </w:r>
+          <w:proofErr w:type="gramEnd"/>
+          <w:r>
+            <w:rPr>
+              <w:rFonts w:ascii="Times New Roman" w:hAnsi="Times New Roman"/>
+              <w:b/>
+              <w:sz w:val="16"/>
+              <w:szCs w:val="14"/>
+            </w:rPr>
+            <w:t>}}</w:t>
+          </w:r>
+          <w:bookmarkEnd w:id="187"/>
+          <w:bookmarkEnd w:id="188"/>
+        </w:p>
+      </w:tc>
+    </w:tr>
+  </w:tbl>
   <w:p>
     <w:pPr>
       <w:pBdr>
@@ -11335,6 +11000,54 @@
       <w:shd w:val="clear" w:color="auto" w:fill="E1DFDD"/>
     </w:rPr>
   </w:style>
+  <w:style w:type="paragraph" w:styleId="Header">
+    <w:name w:val="header"/>
+    <w:basedOn w:val="Normal"/>
+    <w:link w:val="HeaderChar"/>
+    <w:uiPriority w:val="99"/>
+    <w:unhideWhenUsed/>
+    <w:rsid w:val="003736B4"/>
+    <w:pPr>
+      <w:tabs>
+        <w:tab w:val="center" w:pos="4153"/>
+        <w:tab w:val="right" w:pos="8306"/>
+      </w:tabs>
+    </w:pPr>
+  </w:style>
+  <w:style w:type="character" w:customStyle="1" w:styleId="HeaderChar">
+    <w:name w:val="Header Char"/>
+    <w:basedOn w:val="DefaultParagraphFont"/>
+    <w:link w:val="Header"/>
+    <w:uiPriority w:val="99"/>
+    <w:rsid w:val="003736B4"/>
+    <w:rPr>
+      <w:rFonts w:ascii="SimSun" w:hAnsi="SimSun" w:cs="SimSun"/>
+    </w:rPr>
+  </w:style>
+  <w:style w:type="paragraph" w:styleId="Footer">
+    <w:name w:val="footer"/>
+    <w:basedOn w:val="Normal"/>
+    <w:link w:val="FooterChar"/>
+    <w:uiPriority w:val="99"/>
+    <w:unhideWhenUsed/>
+    <w:rsid w:val="003736B4"/>
+    <w:pPr>
+      <w:tabs>
+        <w:tab w:val="center" w:pos="4153"/>
+        <w:tab w:val="right" w:pos="8306"/>
+      </w:tabs>
+    </w:pPr>
+  </w:style>
+  <w:style w:type="character" w:customStyle="1" w:styleId="FooterChar">
+    <w:name w:val="Footer Char"/>
+    <w:basedOn w:val="DefaultParagraphFont"/>
+    <w:link w:val="Footer"/>
+    <w:uiPriority w:val="99"/>
+    <w:rsid w:val="003736B4"/>
+    <w:rPr>
+      <w:rFonts w:ascii="SimSun" w:hAnsi="SimSun" w:cs="SimSun"/>
+    </w:rPr>
+  </w:style>
 </w:styles>
 </file>
 

</xml_diff>

<commit_message>
- updated templates - added decimal for aircon kwh input - added tenancy type
</commit_message>
<xml_diff>
--- a/agreements/1. Move in Form - quantity.docx
+++ b/agreements/1. Move in Form - quantity.docx
@@ -2001,18 +2001,7 @@
                                       <w:szCs w:val="20"/>
                                       <w:fitText w:val="480" w:id="1031"/>
                                     </w:rPr>
-                                    <w:t>{{q4}</w:t>
-                                  </w:r>
-                                  <w:r>
-                                    <w:rPr>
-                                      <w:rFonts w:ascii="Times New Roman" w:hAnsi="Times New Roman" w:cs="Times New Roman"/>
-                                      <w:spacing w:val="1"/>
-                                      <w:w w:val="82"/>
-                                      <w:sz w:val="20"/>
-                                      <w:szCs w:val="20"/>
-                                      <w:fitText w:val="480" w:id="1031"/>
-                                    </w:rPr>
-                                    <w:t>}</w:t>
+                                    <w:t>{{q4}}</w:t>
                                   </w:r>
                                   <w:bookmarkEnd w:id="30"/>
                                 </w:p>
@@ -6055,18 +6044,7 @@
                                 <w:szCs w:val="20"/>
                                 <w:fitText w:val="480" w:id="1031"/>
                               </w:rPr>
-                              <w:t>{{q4}</w:t>
-                            </w:r>
-                            <w:r>
-                              <w:rPr>
-                                <w:rFonts w:ascii="Times New Roman" w:hAnsi="Times New Roman" w:cs="Times New Roman"/>
-                                <w:spacing w:val="1"/>
-                                <w:w w:val="82"/>
-                                <w:sz w:val="20"/>
-                                <w:szCs w:val="20"/>
-                                <w:fitText w:val="480" w:id="1031"/>
-                              </w:rPr>
-                              <w:t>}</w:t>
+                              <w:t>{{q4}}</w:t>
                             </w:r>
                             <w:bookmarkEnd w:id="113"/>
                           </w:p>
@@ -9983,12 +9961,7 @@
       <w:bookmarkEnd w:id="180"/>
     </w:p>
     <w:sectPr>
-      <w:headerReference w:type="even" r:id="rId9"/>
-      <w:headerReference w:type="default" r:id="rId10"/>
-      <w:footerReference w:type="even" r:id="rId11"/>
-      <w:footerReference w:type="default" r:id="rId12"/>
-      <w:headerReference w:type="first" r:id="rId13"/>
-      <w:footerReference w:type="first" r:id="rId14"/>
+      <w:headerReference w:type="first" r:id="rId9"/>
       <w:type w:val="continuous"/>
       <w:pgSz w:w="12240" w:h="15840"/>
       <w:pgMar w:top="1040" w:right="1080" w:bottom="280" w:left="1440" w:header="1300" w:footer="720" w:gutter="0"/>
@@ -10018,36 +9991,6 @@
 </w:endnotes>
 </file>
 
-<file path=word/footer1.xml><?xml version="1.0" encoding="utf-8"?>
-<w:ftr xmlns:wpc="http://schemas.microsoft.com/office/word/2010/wordprocessingCanvas" xmlns:cx="http://schemas.microsoft.com/office/drawing/2014/chartex" xmlns:cx1="http://schemas.microsoft.com/office/drawing/2015/9/8/chartex" xmlns:cx2="http://schemas.microsoft.com/office/drawing/2015/10/21/chartex" xmlns:cx3="http://schemas.microsoft.com/office/drawing/2016/5/9/chartex" xmlns:cx4="http://schemas.microsoft.com/office/drawing/2016/5/10/chartex" xmlns:cx5="http://schemas.microsoft.com/office/drawing/2016/5/11/chartex" xmlns:cx6="http://schemas.microsoft.com/office/drawing/2016/5/12/chartex" xmlns:cx7="http://schemas.microsoft.com/office/drawing/2016/5/13/chartex" xmlns:cx8="http://schemas.microsoft.com/office/drawing/2016/5/14/chartex" xmlns:mc="http://schemas.openxmlformats.org/markup-compatibility/2006" xmlns:aink="http://schemas.microsoft.com/office/drawing/2016/ink" xmlns:am3d="http://schemas.microsoft.com/office/drawing/2017/model3d" xmlns:o="urn:schemas-microsoft-com:office:office" xmlns:oel="http://schemas.microsoft.com/office/2019/extlst" xmlns:r="http://schemas.openxmlformats.org/officeDocument/2006/relationships" xmlns:m="http://schemas.openxmlformats.org/officeDocument/2006/math" xmlns:v="urn:schemas-microsoft-com:vml" xmlns:wp14="http://schemas.microsoft.com/office/word/2010/wordprocessingDrawing" xmlns:wp="http://schemas.openxmlformats.org/drawingml/2006/wordprocessingDrawing" xmlns:w10="urn:schemas-microsoft-com:office:word" xmlns:w="http://schemas.openxmlformats.org/wordprocessingml/2006/main" xmlns:w14="http://schemas.microsoft.com/office/word/2010/wordml" xmlns:w15="http://schemas.microsoft.com/office/word/2012/wordml" xmlns:w16cex="http://schemas.microsoft.com/office/word/2018/wordml/cex" xmlns:w16cid="http://schemas.microsoft.com/office/word/2016/wordml/cid" xmlns:w16="http://schemas.microsoft.com/office/word/2018/wordml" xmlns:w16du="http://schemas.microsoft.com/office/word/2023/wordml/word16du" xmlns:w16sdtdh="http://schemas.microsoft.com/office/word/2020/wordml/sdtdatahash" xmlns:w16sdtfl="http://schemas.microsoft.com/office/word/2024/wordml/sdtformatlock" xmlns:w16se="http://schemas.microsoft.com/office/word/2015/wordml/symex" xmlns:wpg="http://schemas.microsoft.com/office/word/2010/wordprocessingGroup" xmlns:wpi="http://schemas.microsoft.com/office/word/2010/wordprocessingInk" xmlns:wne="http://schemas.microsoft.com/office/word/2006/wordml" xmlns:wps="http://schemas.microsoft.com/office/word/2010/wordprocessingShape" mc:Ignorable="w14 w15 w16se w16cid w16 w16cex w16sdtdh w16sdtfl w16du wp14">
-  <w:p>
-    <w:pPr>
-      <w:pStyle w:val="Footer"/>
-    </w:pPr>
-  </w:p>
-</w:ftr>
-</file>
-
-<file path=word/footer2.xml><?xml version="1.0" encoding="utf-8"?>
-<w:ftr xmlns:wpc="http://schemas.microsoft.com/office/word/2010/wordprocessingCanvas" xmlns:cx="http://schemas.microsoft.com/office/drawing/2014/chartex" xmlns:cx1="http://schemas.microsoft.com/office/drawing/2015/9/8/chartex" xmlns:cx2="http://schemas.microsoft.com/office/drawing/2015/10/21/chartex" xmlns:cx3="http://schemas.microsoft.com/office/drawing/2016/5/9/chartex" xmlns:cx4="http://schemas.microsoft.com/office/drawing/2016/5/10/chartex" xmlns:cx5="http://schemas.microsoft.com/office/drawing/2016/5/11/chartex" xmlns:cx6="http://schemas.microsoft.com/office/drawing/2016/5/12/chartex" xmlns:cx7="http://schemas.microsoft.com/office/drawing/2016/5/13/chartex" xmlns:cx8="http://schemas.microsoft.com/office/drawing/2016/5/14/chartex" xmlns:mc="http://schemas.openxmlformats.org/markup-compatibility/2006" xmlns:aink="http://schemas.microsoft.com/office/drawing/2016/ink" xmlns:am3d="http://schemas.microsoft.com/office/drawing/2017/model3d" xmlns:o="urn:schemas-microsoft-com:office:office" xmlns:oel="http://schemas.microsoft.com/office/2019/extlst" xmlns:r="http://schemas.openxmlformats.org/officeDocument/2006/relationships" xmlns:m="http://schemas.openxmlformats.org/officeDocument/2006/math" xmlns:v="urn:schemas-microsoft-com:vml" xmlns:wp14="http://schemas.microsoft.com/office/word/2010/wordprocessingDrawing" xmlns:wp="http://schemas.openxmlformats.org/drawingml/2006/wordprocessingDrawing" xmlns:w10="urn:schemas-microsoft-com:office:word" xmlns:w="http://schemas.openxmlformats.org/wordprocessingml/2006/main" xmlns:w14="http://schemas.microsoft.com/office/word/2010/wordml" xmlns:w15="http://schemas.microsoft.com/office/word/2012/wordml" xmlns:w16cex="http://schemas.microsoft.com/office/word/2018/wordml/cex" xmlns:w16cid="http://schemas.microsoft.com/office/word/2016/wordml/cid" xmlns:w16="http://schemas.microsoft.com/office/word/2018/wordml" xmlns:w16du="http://schemas.microsoft.com/office/word/2023/wordml/word16du" xmlns:w16sdtdh="http://schemas.microsoft.com/office/word/2020/wordml/sdtdatahash" xmlns:w16sdtfl="http://schemas.microsoft.com/office/word/2024/wordml/sdtformatlock" xmlns:w16se="http://schemas.microsoft.com/office/word/2015/wordml/symex" xmlns:wpg="http://schemas.microsoft.com/office/word/2010/wordprocessingGroup" xmlns:wpi="http://schemas.microsoft.com/office/word/2010/wordprocessingInk" xmlns:wne="http://schemas.microsoft.com/office/word/2006/wordml" xmlns:wps="http://schemas.microsoft.com/office/word/2010/wordprocessingShape" mc:Ignorable="w14 w15 w16se w16cid w16 w16cex w16sdtdh w16sdtfl w16du wp14">
-  <w:p>
-    <w:pPr>
-      <w:pStyle w:val="Footer"/>
-    </w:pPr>
-  </w:p>
-</w:ftr>
-</file>
-
-<file path=word/footer3.xml><?xml version="1.0" encoding="utf-8"?>
-<w:ftr xmlns:wpc="http://schemas.microsoft.com/office/word/2010/wordprocessingCanvas" xmlns:cx="http://schemas.microsoft.com/office/drawing/2014/chartex" xmlns:cx1="http://schemas.microsoft.com/office/drawing/2015/9/8/chartex" xmlns:cx2="http://schemas.microsoft.com/office/drawing/2015/10/21/chartex" xmlns:cx3="http://schemas.microsoft.com/office/drawing/2016/5/9/chartex" xmlns:cx4="http://schemas.microsoft.com/office/drawing/2016/5/10/chartex" xmlns:cx5="http://schemas.microsoft.com/office/drawing/2016/5/11/chartex" xmlns:cx6="http://schemas.microsoft.com/office/drawing/2016/5/12/chartex" xmlns:cx7="http://schemas.microsoft.com/office/drawing/2016/5/13/chartex" xmlns:cx8="http://schemas.microsoft.com/office/drawing/2016/5/14/chartex" xmlns:mc="http://schemas.openxmlformats.org/markup-compatibility/2006" xmlns:aink="http://schemas.microsoft.com/office/drawing/2016/ink" xmlns:am3d="http://schemas.microsoft.com/office/drawing/2017/model3d" xmlns:o="urn:schemas-microsoft-com:office:office" xmlns:oel="http://schemas.microsoft.com/office/2019/extlst" xmlns:r="http://schemas.openxmlformats.org/officeDocument/2006/relationships" xmlns:m="http://schemas.openxmlformats.org/officeDocument/2006/math" xmlns:v="urn:schemas-microsoft-com:vml" xmlns:wp14="http://schemas.microsoft.com/office/word/2010/wordprocessingDrawing" xmlns:wp="http://schemas.openxmlformats.org/drawingml/2006/wordprocessingDrawing" xmlns:w10="urn:schemas-microsoft-com:office:word" xmlns:w="http://schemas.openxmlformats.org/wordprocessingml/2006/main" xmlns:w14="http://schemas.microsoft.com/office/word/2010/wordml" xmlns:w15="http://schemas.microsoft.com/office/word/2012/wordml" xmlns:w16cex="http://schemas.microsoft.com/office/word/2018/wordml/cex" xmlns:w16cid="http://schemas.microsoft.com/office/word/2016/wordml/cid" xmlns:w16="http://schemas.microsoft.com/office/word/2018/wordml" xmlns:w16du="http://schemas.microsoft.com/office/word/2023/wordml/word16du" xmlns:w16sdtdh="http://schemas.microsoft.com/office/word/2020/wordml/sdtdatahash" xmlns:w16sdtfl="http://schemas.microsoft.com/office/word/2024/wordml/sdtformatlock" xmlns:w16se="http://schemas.microsoft.com/office/word/2015/wordml/symex" xmlns:wpg="http://schemas.microsoft.com/office/word/2010/wordprocessingGroup" xmlns:wpi="http://schemas.microsoft.com/office/word/2010/wordprocessingInk" xmlns:wne="http://schemas.microsoft.com/office/word/2006/wordml" xmlns:wps="http://schemas.microsoft.com/office/word/2010/wordprocessingShape" mc:Ignorable="w14 w15 w16se w16cid w16 w16cex w16sdtdh w16sdtfl w16du wp14">
-  <w:p>
-    <w:pPr>
-      <w:pStyle w:val="Footer"/>
-    </w:pPr>
-  </w:p>
-</w:ftr>
-</file>
-
 <file path=word/footnotes.xml><?xml version="1.0" encoding="utf-8"?>
 <w:footnotes xmlns:wpc="http://schemas.microsoft.com/office/word/2010/wordprocessingCanvas" xmlns:cx="http://schemas.microsoft.com/office/drawing/2014/chartex" xmlns:cx1="http://schemas.microsoft.com/office/drawing/2015/9/8/chartex" xmlns:cx2="http://schemas.microsoft.com/office/drawing/2015/10/21/chartex" xmlns:cx3="http://schemas.microsoft.com/office/drawing/2016/5/9/chartex" xmlns:cx4="http://schemas.microsoft.com/office/drawing/2016/5/10/chartex" xmlns:cx5="http://schemas.microsoft.com/office/drawing/2016/5/11/chartex" xmlns:cx6="http://schemas.microsoft.com/office/drawing/2016/5/12/chartex" xmlns:cx7="http://schemas.microsoft.com/office/drawing/2016/5/13/chartex" xmlns:cx8="http://schemas.microsoft.com/office/drawing/2016/5/14/chartex" xmlns:mc="http://schemas.openxmlformats.org/markup-compatibility/2006" xmlns:aink="http://schemas.microsoft.com/office/drawing/2016/ink" xmlns:am3d="http://schemas.microsoft.com/office/drawing/2017/model3d" xmlns:o="urn:schemas-microsoft-com:office:office" xmlns:oel="http://schemas.microsoft.com/office/2019/extlst" xmlns:r="http://schemas.openxmlformats.org/officeDocument/2006/relationships" xmlns:m="http://schemas.openxmlformats.org/officeDocument/2006/math" xmlns:v="urn:schemas-microsoft-com:vml" xmlns:wp14="http://schemas.microsoft.com/office/word/2010/wordprocessingDrawing" xmlns:wp="http://schemas.openxmlformats.org/drawingml/2006/wordprocessingDrawing" xmlns:w10="urn:schemas-microsoft-com:office:word" xmlns:w="http://schemas.openxmlformats.org/wordprocessingml/2006/main" xmlns:w14="http://schemas.microsoft.com/office/word/2010/wordml" xmlns:w15="http://schemas.microsoft.com/office/word/2012/wordml" xmlns:w16cex="http://schemas.microsoft.com/office/word/2018/wordml/cex" xmlns:w16cid="http://schemas.microsoft.com/office/word/2016/wordml/cid" xmlns:w16="http://schemas.microsoft.com/office/word/2018/wordml" xmlns:w16du="http://schemas.microsoft.com/office/word/2023/wordml/word16du" xmlns:w16sdtdh="http://schemas.microsoft.com/office/word/2020/wordml/sdtdatahash" xmlns:w16sdtfl="http://schemas.microsoft.com/office/word/2024/wordml/sdtformatlock" xmlns:w16se="http://schemas.microsoft.com/office/word/2015/wordml/symex" xmlns:wpg="http://schemas.microsoft.com/office/word/2010/wordprocessingGroup" xmlns:wpi="http://schemas.microsoft.com/office/word/2010/wordprocessingInk" xmlns:wne="http://schemas.microsoft.com/office/word/2006/wordml" xmlns:wps="http://schemas.microsoft.com/office/word/2010/wordprocessingShape" mc:Ignorable="w14 w15 w16se w16cid w16 w16cex w16sdtdh w16sdtfl w16du wp14">
   <w:footnote w:type="separator" w:id="-1">
@@ -10069,26 +10012,6 @@
 
 <file path=word/header1.xml><?xml version="1.0" encoding="utf-8"?>
 <w:hdr xmlns:wpc="http://schemas.microsoft.com/office/word/2010/wordprocessingCanvas" xmlns:cx="http://schemas.microsoft.com/office/drawing/2014/chartex" xmlns:cx1="http://schemas.microsoft.com/office/drawing/2015/9/8/chartex" xmlns:cx2="http://schemas.microsoft.com/office/drawing/2015/10/21/chartex" xmlns:cx3="http://schemas.microsoft.com/office/drawing/2016/5/9/chartex" xmlns:cx4="http://schemas.microsoft.com/office/drawing/2016/5/10/chartex" xmlns:cx5="http://schemas.microsoft.com/office/drawing/2016/5/11/chartex" xmlns:cx6="http://schemas.microsoft.com/office/drawing/2016/5/12/chartex" xmlns:cx7="http://schemas.microsoft.com/office/drawing/2016/5/13/chartex" xmlns:cx8="http://schemas.microsoft.com/office/drawing/2016/5/14/chartex" xmlns:mc="http://schemas.openxmlformats.org/markup-compatibility/2006" xmlns:aink="http://schemas.microsoft.com/office/drawing/2016/ink" xmlns:am3d="http://schemas.microsoft.com/office/drawing/2017/model3d" xmlns:o="urn:schemas-microsoft-com:office:office" xmlns:oel="http://schemas.microsoft.com/office/2019/extlst" xmlns:r="http://schemas.openxmlformats.org/officeDocument/2006/relationships" xmlns:m="http://schemas.openxmlformats.org/officeDocument/2006/math" xmlns:v="urn:schemas-microsoft-com:vml" xmlns:wp14="http://schemas.microsoft.com/office/word/2010/wordprocessingDrawing" xmlns:wp="http://schemas.openxmlformats.org/drawingml/2006/wordprocessingDrawing" xmlns:w10="urn:schemas-microsoft-com:office:word" xmlns:w="http://schemas.openxmlformats.org/wordprocessingml/2006/main" xmlns:w14="http://schemas.microsoft.com/office/word/2010/wordml" xmlns:w15="http://schemas.microsoft.com/office/word/2012/wordml" xmlns:w16cex="http://schemas.microsoft.com/office/word/2018/wordml/cex" xmlns:w16cid="http://schemas.microsoft.com/office/word/2016/wordml/cid" xmlns:w16="http://schemas.microsoft.com/office/word/2018/wordml" xmlns:w16du="http://schemas.microsoft.com/office/word/2023/wordml/word16du" xmlns:w16sdtdh="http://schemas.microsoft.com/office/word/2020/wordml/sdtdatahash" xmlns:w16sdtfl="http://schemas.microsoft.com/office/word/2024/wordml/sdtformatlock" xmlns:w16se="http://schemas.microsoft.com/office/word/2015/wordml/symex" xmlns:wpg="http://schemas.microsoft.com/office/word/2010/wordprocessingGroup" xmlns:wpi="http://schemas.microsoft.com/office/word/2010/wordprocessingInk" xmlns:wne="http://schemas.microsoft.com/office/word/2006/wordml" xmlns:wps="http://schemas.microsoft.com/office/word/2010/wordprocessingShape" mc:Ignorable="w14 w15 w16se w16cid w16 w16cex w16sdtdh w16sdtfl w16du wp14">
-  <w:p>
-    <w:pPr>
-      <w:pStyle w:val="Header"/>
-    </w:pPr>
-  </w:p>
-</w:hdr>
-</file>
-
-<file path=word/header2.xml><?xml version="1.0" encoding="utf-8"?>
-<w:hdr xmlns:wpc="http://schemas.microsoft.com/office/word/2010/wordprocessingCanvas" xmlns:cx="http://schemas.microsoft.com/office/drawing/2014/chartex" xmlns:cx1="http://schemas.microsoft.com/office/drawing/2015/9/8/chartex" xmlns:cx2="http://schemas.microsoft.com/office/drawing/2015/10/21/chartex" xmlns:cx3="http://schemas.microsoft.com/office/drawing/2016/5/9/chartex" xmlns:cx4="http://schemas.microsoft.com/office/drawing/2016/5/10/chartex" xmlns:cx5="http://schemas.microsoft.com/office/drawing/2016/5/11/chartex" xmlns:cx6="http://schemas.microsoft.com/office/drawing/2016/5/12/chartex" xmlns:cx7="http://schemas.microsoft.com/office/drawing/2016/5/13/chartex" xmlns:cx8="http://schemas.microsoft.com/office/drawing/2016/5/14/chartex" xmlns:mc="http://schemas.openxmlformats.org/markup-compatibility/2006" xmlns:aink="http://schemas.microsoft.com/office/drawing/2016/ink" xmlns:am3d="http://schemas.microsoft.com/office/drawing/2017/model3d" xmlns:o="urn:schemas-microsoft-com:office:office" xmlns:oel="http://schemas.microsoft.com/office/2019/extlst" xmlns:r="http://schemas.openxmlformats.org/officeDocument/2006/relationships" xmlns:m="http://schemas.openxmlformats.org/officeDocument/2006/math" xmlns:v="urn:schemas-microsoft-com:vml" xmlns:wp14="http://schemas.microsoft.com/office/word/2010/wordprocessingDrawing" xmlns:wp="http://schemas.openxmlformats.org/drawingml/2006/wordprocessingDrawing" xmlns:w10="urn:schemas-microsoft-com:office:word" xmlns:w="http://schemas.openxmlformats.org/wordprocessingml/2006/main" xmlns:w14="http://schemas.microsoft.com/office/word/2010/wordml" xmlns:w15="http://schemas.microsoft.com/office/word/2012/wordml" xmlns:w16cex="http://schemas.microsoft.com/office/word/2018/wordml/cex" xmlns:w16cid="http://schemas.microsoft.com/office/word/2016/wordml/cid" xmlns:w16="http://schemas.microsoft.com/office/word/2018/wordml" xmlns:w16du="http://schemas.microsoft.com/office/word/2023/wordml/word16du" xmlns:w16sdtdh="http://schemas.microsoft.com/office/word/2020/wordml/sdtdatahash" xmlns:w16sdtfl="http://schemas.microsoft.com/office/word/2024/wordml/sdtformatlock" xmlns:w16se="http://schemas.microsoft.com/office/word/2015/wordml/symex" xmlns:wpg="http://schemas.microsoft.com/office/word/2010/wordprocessingGroup" xmlns:wpi="http://schemas.microsoft.com/office/word/2010/wordprocessingInk" xmlns:wne="http://schemas.microsoft.com/office/word/2006/wordml" xmlns:wps="http://schemas.microsoft.com/office/word/2010/wordprocessingShape" mc:Ignorable="w14 w15 w16se w16cid w16 w16cex w16sdtdh w16sdtfl w16du wp14">
-  <w:p>
-    <w:pPr>
-      <w:pStyle w:val="Header"/>
-    </w:pPr>
-  </w:p>
-</w:hdr>
-</file>
-
-<file path=word/header3.xml><?xml version="1.0" encoding="utf-8"?>
-<w:hdr xmlns:wpc="http://schemas.microsoft.com/office/word/2010/wordprocessingCanvas" xmlns:cx="http://schemas.microsoft.com/office/drawing/2014/chartex" xmlns:cx1="http://schemas.microsoft.com/office/drawing/2015/9/8/chartex" xmlns:cx2="http://schemas.microsoft.com/office/drawing/2015/10/21/chartex" xmlns:cx3="http://schemas.microsoft.com/office/drawing/2016/5/9/chartex" xmlns:cx4="http://schemas.microsoft.com/office/drawing/2016/5/10/chartex" xmlns:cx5="http://schemas.microsoft.com/office/drawing/2016/5/11/chartex" xmlns:cx6="http://schemas.microsoft.com/office/drawing/2016/5/12/chartex" xmlns:cx7="http://schemas.microsoft.com/office/drawing/2016/5/13/chartex" xmlns:cx8="http://schemas.microsoft.com/office/drawing/2016/5/14/chartex" xmlns:mc="http://schemas.openxmlformats.org/markup-compatibility/2006" xmlns:aink="http://schemas.microsoft.com/office/drawing/2016/ink" xmlns:am3d="http://schemas.microsoft.com/office/drawing/2017/model3d" xmlns:o="urn:schemas-microsoft-com:office:office" xmlns:oel="http://schemas.microsoft.com/office/2019/extlst" xmlns:r="http://schemas.openxmlformats.org/officeDocument/2006/relationships" xmlns:m="http://schemas.openxmlformats.org/officeDocument/2006/math" xmlns:v="urn:schemas-microsoft-com:vml" xmlns:wp14="http://schemas.microsoft.com/office/word/2010/wordprocessingDrawing" xmlns:wp="http://schemas.openxmlformats.org/drawingml/2006/wordprocessingDrawing" xmlns:w10="urn:schemas-microsoft-com:office:word" xmlns:w="http://schemas.openxmlformats.org/wordprocessingml/2006/main" xmlns:w14="http://schemas.microsoft.com/office/word/2010/wordml" xmlns:w15="http://schemas.microsoft.com/office/word/2012/wordml" xmlns:w16cex="http://schemas.microsoft.com/office/word/2018/wordml/cex" xmlns:w16cid="http://schemas.microsoft.com/office/word/2016/wordml/cid" xmlns:w16="http://schemas.microsoft.com/office/word/2018/wordml" xmlns:w16du="http://schemas.microsoft.com/office/word/2023/wordml/word16du" xmlns:w16sdtdh="http://schemas.microsoft.com/office/word/2020/wordml/sdtdatahash" xmlns:w16sdtfl="http://schemas.microsoft.com/office/word/2024/wordml/sdtformatlock" xmlns:w16se="http://schemas.microsoft.com/office/word/2015/wordml/symex" xmlns:wpg="http://schemas.microsoft.com/office/word/2010/wordprocessingGroup" xmlns:wpi="http://schemas.microsoft.com/office/word/2010/wordprocessingInk" xmlns:wne="http://schemas.microsoft.com/office/word/2006/wordml" xmlns:wps="http://schemas.microsoft.com/office/word/2010/wordprocessingShape" mc:Ignorable="w14 w15 w16se w16cid w16 w16cex w16sdtdh w16sdtfl w16du wp14">
   <w:tbl>
     <w:tblPr>
       <w:tblStyle w:val="TableGrid"/>
@@ -10096,8 +10019,8 @@
       <w:tblLook w:val="04A0" w:firstRow="1" w:lastRow="0" w:firstColumn="1" w:lastColumn="0" w:noHBand="0" w:noVBand="1"/>
     </w:tblPr>
     <w:tblGrid>
-      <w:gridCol w:w="4968"/>
-      <w:gridCol w:w="4968"/>
+      <w:gridCol w:w="4338"/>
+      <w:gridCol w:w="5598"/>
     </w:tblGrid>
     <w:tr>
       <w:trPr>
@@ -10105,7 +10028,7 @@
       </w:trPr>
       <w:tc>
         <w:tcPr>
-          <w:tcW w:w="4968" w:type="dxa"/>
+          <w:tcW w:w="4338" w:type="dxa"/>
           <w:tcBorders>
             <w:top w:val="nil"/>
             <w:left w:val="nil"/>
@@ -10163,7 +10086,7 @@
       </w:tc>
       <w:tc>
         <w:tcPr>
-          <w:tcW w:w="4968" w:type="dxa"/>
+          <w:tcW w:w="5598" w:type="dxa"/>
           <w:tcBorders>
             <w:top w:val="nil"/>
             <w:left w:val="nil"/>

</xml_diff>

<commit_message>
- updated move in form
</commit_message>
<xml_diff>
--- a/agreements/1. Move in Form - quantity.docx
+++ b/agreements/1. Move in Form - quantity.docx
@@ -2834,7 +2834,7 @@
                                       <w:sz w:val="20"/>
                                       <w:szCs w:val="20"/>
                                     </w:rPr>
-                                    <w:t>Mattress</w:t>
+                                    <w:t>Bedsheet</w:t>
                                   </w:r>
                                   <w:r>
                                     <w:rPr>
@@ -6139,7 +6139,7 @@
                                 <w:sz w:val="20"/>
                                 <w:szCs w:val="20"/>
                               </w:rPr>
-                              <w:t>Mattress</w:t>
+                              <w:t>Bedsheet</w:t>
                             </w:r>
                             <w:r>
                               <w:rPr>

</xml_diff>